<commit_message>
Finished all Organizational and Standards Documents
</commit_message>
<xml_diff>
--- a/01_Standards/Required_Tools_&_Their_Workflow.docx
+++ b/01_Standards/Required_Tools_&_Their_Workflow.docx
@@ -134,13 +134,7 @@
           <w:rPr>
             <w:rStyle w:val="Hyperlink"/>
           </w:rPr>
-          <w:t>https://w</w:t>
-        </w:r>
-        <w:r>
-          <w:rPr>
-            <w:rStyle w:val="Hyperlink"/>
-          </w:rPr>
-          <w:t>ebmailbyui-my.sharepoint.com/</w:t>
+          <w:t>https://webmailbyui-my.sharepoint.com/</w:t>
         </w:r>
       </w:hyperlink>
       <w:r>
@@ -208,22 +202,7 @@
         <w:t>You will need to a</w:t>
       </w:r>
       <w:r>
-        <w:t>ccept the collaborator</w:t>
-      </w:r>
-      <w:r>
-        <w:t xml:space="preserve"> </w:t>
-      </w:r>
-      <w:r>
-        <w:t xml:space="preserve">invite </w:t>
-      </w:r>
-      <w:r>
-        <w:t>to the</w:t>
-      </w:r>
-      <w:r>
-        <w:t xml:space="preserve"> </w:t>
-      </w:r>
-      <w:r>
-        <w:t xml:space="preserve">project </w:t>
+        <w:t xml:space="preserve">ccept the collaborator invite to the project </w:t>
       </w:r>
       <w:r>
         <w:rPr>
@@ -380,39 +359,14 @@
             <w:rStyle w:val="Hyperlink"/>
             <w:rFonts w:eastAsia="Times New Roman" w:cs="Times New Roman"/>
           </w:rPr>
-          <w:t>https://trello.com/b/TZn4KFEu/career</w:t>
-        </w:r>
-        <w:r>
-          <w:rPr>
-            <w:rStyle w:val="Hyperlink"/>
-            <w:rFonts w:eastAsia="Times New Roman" w:cs="Times New Roman"/>
-          </w:rPr>
-          <w:t>bound-sdd</w:t>
+          <w:t>https://trello.com/b/TZn4KFEu/careerbound-sdd</w:t>
         </w:r>
       </w:hyperlink>
       <w:r>
         <w:rPr>
           <w:rFonts w:eastAsia="Times New Roman" w:cs="Times New Roman"/>
         </w:rPr>
-        <w:t xml:space="preserve"> - For this to work y</w:t>
-      </w:r>
-      <w:r>
-        <w:rPr>
-          <w:rFonts w:eastAsia="Times New Roman" w:cs="Times New Roman"/>
-        </w:rPr>
-        <w:t xml:space="preserve">ou must accept the invite </w:t>
-      </w:r>
-      <w:r>
-        <w:rPr>
-          <w:rFonts w:eastAsia="Times New Roman" w:cs="Times New Roman"/>
-        </w:rPr>
-        <w:t xml:space="preserve">I sent you </w:t>
-      </w:r>
-      <w:r>
-        <w:rPr>
-          <w:rFonts w:eastAsia="Times New Roman" w:cs="Times New Roman"/>
-        </w:rPr>
-        <w:t>in your BYUI email)</w:t>
+        <w:t xml:space="preserve"> - For this to work you must accept the invite I sent you in your BYUI email)</w:t>
       </w:r>
       <w:r>
         <w:rPr>
@@ -472,14 +426,7 @@
             <w:rStyle w:val="Hyperlink"/>
             <w:rFonts w:eastAsia="Times New Roman" w:cs="Times New Roman"/>
           </w:rPr>
-          <w:t>https://teams.microsoft.co</w:t>
-        </w:r>
-        <w:r>
-          <w:rPr>
-            <w:rStyle w:val="Hyperlink"/>
-            <w:rFonts w:eastAsia="Times New Roman" w:cs="Times New Roman"/>
-          </w:rPr>
-          <w:t>m/v2/</w:t>
+          <w:t>https://teams.microsoft.com/v2/</w:t>
         </w:r>
       </w:hyperlink>
       <w:r>
@@ -516,19 +463,7 @@
           <w:rPr>
             <w:rStyle w:val="Hyperlink"/>
           </w:rPr>
-          <w:t>Gene</w:t>
-        </w:r>
-        <w:r>
-          <w:rPr>
-            <w:rStyle w:val="Hyperlink"/>
-          </w:rPr>
-          <w:t>ral | CSE 4</w:t>
-        </w:r>
-        <w:r>
-          <w:rPr>
-            <w:rStyle w:val="Hyperlink"/>
-          </w:rPr>
-          <w:t>30 - 2026 - Spring</w:t>
+          <w:t>General | CSE 430 - 2026 - Spring</w:t>
         </w:r>
       </w:hyperlink>
       <w:r>
@@ -785,13 +720,7 @@
         <w:rPr>
           <w:rFonts w:eastAsia="Times New Roman"/>
         </w:rPr>
-        <w:t xml:space="preserve"> </w:t>
-      </w:r>
-      <w:r>
-        <w:rPr>
-          <w:rFonts w:eastAsia="Times New Roman"/>
-        </w:rPr>
-        <w:t>VS Code</w:t>
+        <w:t xml:space="preserve"> VS Code</w:t>
       </w:r>
     </w:p>
     <w:p>
@@ -826,16 +755,7 @@
         <w:t>Once you have accepted the invitation as a collaborator</w:t>
       </w:r>
       <w:r>
-        <w:t xml:space="preserve"> </w:t>
-      </w:r>
-      <w:r>
-        <w:t>for the repository on GitHub</w:t>
-      </w:r>
-      <w:r>
-        <w:t xml:space="preserve">, </w:t>
-      </w:r>
-      <w:r>
-        <w:t>clone the repository for use on your local system.</w:t>
+        <w:t xml:space="preserve"> for the repository on GitHub, clone the repository for use on your local system.</w:t>
       </w:r>
     </w:p>
     <w:p>
@@ -886,10 +806,7 @@
       </w:pPr>
       <w:r>
         <w:lastRenderedPageBreak/>
-        <w:t>Create/choose a folder to house the repo locally on your syste</w:t>
-      </w:r>
-      <w:r>
-        <w:t>m (I would give the folder the same name as the repo, but that's up to you)</w:t>
+        <w:t>Create/choose a folder to house the repo locally on your system (I would give the folder the same name as the repo, but that's up to you)</w:t>
       </w:r>
     </w:p>
     <w:p>
@@ -901,10 +818,7 @@
         </w:numPr>
       </w:pPr>
       <w:r>
-        <w:t xml:space="preserve">In VS Code </w:t>
-      </w:r>
-      <w:r>
-        <w:t>press Ctrl + Shift + P, type: Git: Clone</w:t>
+        <w:t>In VS Code press Ctrl + Shift + P, type: Git: Clone</w:t>
       </w:r>
     </w:p>
     <w:p>
@@ -916,19 +830,7 @@
         </w:numPr>
       </w:pPr>
       <w:r>
-        <w:t>I</w:t>
-      </w:r>
-      <w:r>
-        <w:t xml:space="preserve">n the window that pops up on top, paste the repo URL </w:t>
-      </w:r>
-      <w:r>
-        <w:t xml:space="preserve">and select the folder </w:t>
-      </w:r>
-      <w:r>
-        <w:t>to clone</w:t>
-      </w:r>
-      <w:r>
-        <w:t xml:space="preserve"> the project into it.</w:t>
+        <w:t>In the window that pops up on top, paste the repo URL and select the folder to clone the project into it.</w:t>
       </w:r>
     </w:p>
     <w:p>
@@ -1053,282 +955,216 @@
         </w:numPr>
       </w:pPr>
       <w:r>
-        <w:t xml:space="preserve">Pull Requests will only be used for </w:t>
-      </w:r>
-      <w:r>
-        <w:t>anything going into the</w:t>
+        <w:t>Pull Requests will only be used for anything going into the</w:t>
+      </w:r>
+      <w:r>
+        <w:t xml:space="preserve"> 04_QA_Review/Approved</w:t>
+      </w:r>
+      <w:r>
+        <w:t xml:space="preserve"> folder and </w:t>
+      </w:r>
+      <w:r>
+        <w:t>05_Final_SDD</w:t>
+      </w:r>
+      <w:r>
+        <w:t xml:space="preserve"> folder by the Chief of Q/A after the Chief of Q/A has approved it.</w:t>
+      </w:r>
+      <w:r>
+        <w:t xml:space="preserve"> To make the Pull Request the Chief of Q/A will do the following:</w:t>
+      </w:r>
+    </w:p>
+    <w:p>
+      <w:pPr>
+        <w:pStyle w:val="ListParagraph"/>
+        <w:numPr>
+          <w:ilvl w:val="0"/>
+          <w:numId w:val="2"/>
+        </w:numPr>
+      </w:pPr>
+      <w:r>
+        <w:t>Open the Repository in VS Code</w:t>
+      </w:r>
+    </w:p>
+    <w:p>
+      <w:pPr>
+        <w:pStyle w:val="ListParagraph"/>
+        <w:numPr>
+          <w:ilvl w:val="0"/>
+          <w:numId w:val="2"/>
+        </w:numPr>
+      </w:pPr>
+      <w:r>
+        <w:t>Pull any changes by going to the Source Control, clicking on the 3 dots next to the Repository name, and selecting Pull from the dropdown menu.</w:t>
+      </w:r>
+    </w:p>
+    <w:p>
+      <w:pPr>
+        <w:pStyle w:val="ListParagraph"/>
+        <w:numPr>
+          <w:ilvl w:val="0"/>
+          <w:numId w:val="2"/>
+        </w:numPr>
+      </w:pPr>
+      <w:r>
+        <w:t>Click the branch name</w:t>
       </w:r>
       <w:r>
         <w:t xml:space="preserve"> </w:t>
       </w:r>
       <w:r>
-        <w:t>04_QA_Review/Approved</w:t>
-      </w:r>
-      <w:r>
-        <w:t xml:space="preserve"> folder and </w:t>
-      </w:r>
-      <w:r>
-        <w:t>05_Final_SDD</w:t>
-      </w:r>
-      <w:r>
-        <w:t xml:space="preserve"> folder by the Chief of Q/A after the </w:t>
-      </w:r>
-      <w:r>
-        <w:t>Chief of Q/A</w:t>
-      </w:r>
-      <w:r>
-        <w:t xml:space="preserve"> has approved it.</w:t>
-      </w:r>
-      <w:r>
-        <w:t xml:space="preserve"> To make the Pull Request the Chief of Q/A, Chief Reviewer, Assistant PM or PM will do the following:</w:t>
-      </w:r>
-    </w:p>
-    <w:p>
-      <w:pPr>
-        <w:pStyle w:val="ListParagraph"/>
-        <w:numPr>
-          <w:ilvl w:val="0"/>
-          <w:numId w:val="2"/>
-        </w:numPr>
-      </w:pPr>
-      <w:r>
-        <w:t>Open the Repository in VS Code</w:t>
-      </w:r>
-    </w:p>
-    <w:p>
-      <w:pPr>
-        <w:pStyle w:val="ListParagraph"/>
-        <w:numPr>
-          <w:ilvl w:val="0"/>
-          <w:numId w:val="2"/>
-        </w:numPr>
-      </w:pPr>
-      <w:r>
-        <w:t>Pull any changes by going to the Source Control, clicking on the 3 dots next to the Repository name, and selecting Pull from the dropdown menu.</w:t>
-      </w:r>
-    </w:p>
-    <w:p>
-      <w:pPr>
-        <w:pStyle w:val="ListParagraph"/>
-        <w:numPr>
-          <w:ilvl w:val="0"/>
-          <w:numId w:val="2"/>
-        </w:numPr>
-      </w:pPr>
-      <w:r>
-        <w:t>Click the branch</w:t>
+        <w:t>"main" located on the bottom-left corner</w:t>
+      </w:r>
+    </w:p>
+    <w:p>
+      <w:pPr>
+        <w:pStyle w:val="ListParagraph"/>
+        <w:numPr>
+          <w:ilvl w:val="0"/>
+          <w:numId w:val="2"/>
+        </w:numPr>
+      </w:pPr>
+      <w:r>
+        <w:t>In the dropdown menu than appears at the top of the screen select Create new branch... and enter the appropriate branch name following the naming rules</w:t>
+      </w:r>
+    </w:p>
+    <w:p>
+      <w:pPr>
+        <w:pStyle w:val="ListParagraph"/>
+        <w:numPr>
+          <w:ilvl w:val="0"/>
+          <w:numId w:val="2"/>
+        </w:numPr>
+      </w:pPr>
+      <w:r>
+        <w:t>VS Code will automatically switch to that newly created branch</w:t>
+      </w:r>
+    </w:p>
+    <w:p>
+      <w:pPr>
+        <w:pStyle w:val="ListParagraph"/>
+        <w:numPr>
+          <w:ilvl w:val="0"/>
+          <w:numId w:val="2"/>
+        </w:numPr>
+      </w:pPr>
+      <w:r>
+        <w:t>Add the files to be added or integrated into the appropriate folder</w:t>
+      </w:r>
+    </w:p>
+    <w:p>
+      <w:pPr>
+        <w:pStyle w:val="ListParagraph"/>
+        <w:numPr>
+          <w:ilvl w:val="0"/>
+          <w:numId w:val="2"/>
+        </w:numPr>
+      </w:pPr>
+      <w:r>
+        <w:t>Go to Source Control by clicking on the Source Control icon and type in a commit message explaining what is happening and click the Commit button</w:t>
+      </w:r>
+    </w:p>
+    <w:p>
+      <w:pPr>
+        <w:pStyle w:val="ListParagraph"/>
+        <w:numPr>
+          <w:ilvl w:val="0"/>
+          <w:numId w:val="2"/>
+        </w:numPr>
+      </w:pPr>
+      <w:r>
+        <w:t>Click the</w:t>
+      </w:r>
+      <w:r>
+        <w:t xml:space="preserve"> Publish Branch prompt </w:t>
+      </w:r>
+      <w:r>
+        <w:t>that</w:t>
+      </w:r>
+      <w:r>
+        <w:t xml:space="preserve"> appear</w:t>
+      </w:r>
+      <w:r>
+        <w:t>s</w:t>
+      </w:r>
+    </w:p>
+    <w:p>
+      <w:pPr>
+        <w:pStyle w:val="ListParagraph"/>
+        <w:numPr>
+          <w:ilvl w:val="0"/>
+          <w:numId w:val="2"/>
+        </w:numPr>
+      </w:pPr>
+      <w:r>
+        <w:t>Right after publishing go to the Repository on GitHub and you should see a banner saying, “Compare &amp; pull request,” click on it to go to the Pull Request page. If you do not see the banner, click on the Pull requests tab located on the top left of the toolbar to get to the Pull Request page.</w:t>
+      </w:r>
+    </w:p>
+    <w:p>
+      <w:pPr>
+        <w:pStyle w:val="ListParagraph"/>
+        <w:numPr>
+          <w:ilvl w:val="0"/>
+          <w:numId w:val="2"/>
+        </w:numPr>
+      </w:pPr>
+      <w:r>
+        <w:t xml:space="preserve">Click on the green </w:t>
+      </w:r>
+      <w:r>
+        <w:t>"</w:t>
+      </w:r>
+      <w:r>
+        <w:t>New pull request</w:t>
+      </w:r>
+      <w:r>
+        <w:t>"</w:t>
+      </w:r>
+      <w:r>
+        <w:t xml:space="preserve"> button located on the right of the page.</w:t>
+      </w:r>
+    </w:p>
+    <w:p>
+      <w:pPr>
+        <w:pStyle w:val="ListParagraph"/>
+        <w:numPr>
+          <w:ilvl w:val="0"/>
+          <w:numId w:val="2"/>
+        </w:numPr>
+      </w:pPr>
+      <w:r>
+        <w:t xml:space="preserve">At the top on the left set the </w:t>
+      </w:r>
+      <w:r>
+        <w:t>b</w:t>
+      </w:r>
+      <w:r>
+        <w:t>ase</w:t>
+      </w:r>
+      <w:r>
+        <w:t xml:space="preserve">: box to </w:t>
+      </w:r>
+      <w:r>
+        <w:t>main</w:t>
+      </w:r>
+      <w:r>
+        <w:t xml:space="preserve"> and the c</w:t>
+      </w:r>
+      <w:r>
+        <w:t>ompare</w:t>
+      </w:r>
+      <w:r>
+        <w:t>: box to</w:t>
       </w:r>
       <w:r>
         <w:t xml:space="preserve"> </w:t>
       </w:r>
       <w:r>
-        <w:t>name</w:t>
+        <w:t>the</w:t>
       </w:r>
       <w:r>
         <w:t xml:space="preserve"> </w:t>
       </w:r>
       <w:r>
-        <w:t>"</w:t>
-      </w:r>
-      <w:r>
-        <w:t>main</w:t>
-      </w:r>
-      <w:r>
-        <w:t>"</w:t>
-      </w:r>
-      <w:r>
-        <w:t xml:space="preserve"> </w:t>
-      </w:r>
-      <w:r>
-        <w:t xml:space="preserve">located on the </w:t>
-      </w:r>
-      <w:r>
-        <w:t>bottom-left</w:t>
-      </w:r>
-      <w:r>
-        <w:t xml:space="preserve"> corner</w:t>
-      </w:r>
-    </w:p>
-    <w:p>
-      <w:pPr>
-        <w:pStyle w:val="ListParagraph"/>
-        <w:numPr>
-          <w:ilvl w:val="0"/>
-          <w:numId w:val="2"/>
-        </w:numPr>
-      </w:pPr>
-      <w:r>
-        <w:t xml:space="preserve">In the dropdown menu than appears at the top of the screen select </w:t>
-      </w:r>
-      <w:r>
-        <w:t>Create new branch...</w:t>
-      </w:r>
-      <w:r>
-        <w:t xml:space="preserve"> and enter the appropriate branch name following the naming rules</w:t>
-      </w:r>
-    </w:p>
-    <w:p>
-      <w:pPr>
-        <w:pStyle w:val="ListParagraph"/>
-        <w:numPr>
-          <w:ilvl w:val="0"/>
-          <w:numId w:val="2"/>
-        </w:numPr>
-      </w:pPr>
-      <w:r>
-        <w:t>VS Code will automatically switch to that newly created branch</w:t>
-      </w:r>
-    </w:p>
-    <w:p>
-      <w:pPr>
-        <w:pStyle w:val="ListParagraph"/>
-        <w:numPr>
-          <w:ilvl w:val="0"/>
-          <w:numId w:val="2"/>
-        </w:numPr>
-      </w:pPr>
-      <w:r>
-        <w:t>Add the files to be added or integrated into the appropriate folder</w:t>
-      </w:r>
-    </w:p>
-    <w:p>
-      <w:pPr>
-        <w:pStyle w:val="ListParagraph"/>
-        <w:numPr>
-          <w:ilvl w:val="0"/>
-          <w:numId w:val="2"/>
-        </w:numPr>
-      </w:pPr>
-      <w:r>
-        <w:t>Go to Source Control by clicking on the Source Control icon and type in a commit message explaining what is happening and click the Commit button</w:t>
-      </w:r>
-    </w:p>
-    <w:p>
-      <w:pPr>
-        <w:pStyle w:val="ListParagraph"/>
-        <w:numPr>
-          <w:ilvl w:val="0"/>
-          <w:numId w:val="2"/>
-        </w:numPr>
-      </w:pPr>
-      <w:r>
-        <w:t>Click the</w:t>
-      </w:r>
-      <w:r>
-        <w:t xml:space="preserve"> Publish Branch prompt </w:t>
-      </w:r>
-      <w:r>
-        <w:t>that</w:t>
-      </w:r>
-      <w:r>
-        <w:t xml:space="preserve"> appear</w:t>
-      </w:r>
-      <w:r>
-        <w:t>s</w:t>
-      </w:r>
-    </w:p>
-    <w:p>
-      <w:pPr>
-        <w:pStyle w:val="ListParagraph"/>
-        <w:numPr>
-          <w:ilvl w:val="0"/>
-          <w:numId w:val="2"/>
-        </w:numPr>
-      </w:pPr>
-      <w:r>
-        <w:t>Right after</w:t>
-      </w:r>
-      <w:r>
-        <w:t xml:space="preserve"> publishing go to the Repository on GitHub and you should see a banner saying, </w:t>
-      </w:r>
-      <w:r>
-        <w:t>“Compare &amp; pull request</w:t>
-      </w:r>
-      <w:r>
-        <w:t>,</w:t>
-      </w:r>
-      <w:r>
-        <w:t>”</w:t>
-      </w:r>
-      <w:r>
-        <w:t xml:space="preserve"> click on it to go to the Pull Request page. If you do not see the banner, click on the Pull requests tab located on the top left of the toolbar to get to the Pull Request page.</w:t>
-      </w:r>
-    </w:p>
-    <w:p>
-      <w:pPr>
-        <w:pStyle w:val="ListParagraph"/>
-        <w:numPr>
-          <w:ilvl w:val="0"/>
-          <w:numId w:val="2"/>
-        </w:numPr>
-      </w:pPr>
-      <w:r>
-        <w:t>Click</w:t>
-      </w:r>
-      <w:r>
-        <w:t xml:space="preserve"> on the green </w:t>
-      </w:r>
-      <w:r>
-        <w:t>"</w:t>
-      </w:r>
-      <w:r>
-        <w:t>New pull request</w:t>
-      </w:r>
-      <w:r>
-        <w:t>"</w:t>
-      </w:r>
-      <w:r>
-        <w:t xml:space="preserve"> button located on the right of the page.</w:t>
-      </w:r>
-    </w:p>
-    <w:p>
-      <w:pPr>
-        <w:pStyle w:val="ListParagraph"/>
-        <w:numPr>
-          <w:ilvl w:val="0"/>
-          <w:numId w:val="2"/>
-        </w:numPr>
-      </w:pPr>
-      <w:r>
-        <w:t>At the top on the left s</w:t>
-      </w:r>
-      <w:r>
-        <w:t>et</w:t>
-      </w:r>
-      <w:r>
-        <w:t xml:space="preserve"> the </w:t>
-      </w:r>
-      <w:r>
-        <w:t>b</w:t>
-      </w:r>
-      <w:r>
-        <w:t>ase</w:t>
-      </w:r>
-      <w:r>
-        <w:t xml:space="preserve">: box to </w:t>
-      </w:r>
-      <w:r>
-        <w:t>main</w:t>
-      </w:r>
-      <w:r>
-        <w:t xml:space="preserve"> and the c</w:t>
-      </w:r>
-      <w:r>
-        <w:t>ompare</w:t>
-      </w:r>
-      <w:r>
-        <w:t>: box to</w:t>
-      </w:r>
-      <w:r>
-        <w:t xml:space="preserve"> </w:t>
-      </w:r>
-      <w:r>
-        <w:t>the</w:t>
-      </w:r>
-      <w:r>
-        <w:t xml:space="preserve"> </w:t>
-      </w:r>
-      <w:r>
         <w:t xml:space="preserve">new </w:t>
       </w:r>
       <w:r>
@@ -1344,37 +1180,19 @@
         </w:numPr>
       </w:pPr>
       <w:r>
-        <w:t>Add a</w:t>
-      </w:r>
-      <w:r>
-        <w:t xml:space="preserve">n appropriate </w:t>
-      </w:r>
-      <w:r>
-        <w:t>title</w:t>
-      </w:r>
-      <w:r>
-        <w:t xml:space="preserve"> and description</w:t>
-      </w:r>
-    </w:p>
-    <w:p>
-      <w:pPr>
-        <w:pStyle w:val="ListParagraph"/>
-        <w:numPr>
-          <w:ilvl w:val="0"/>
-          <w:numId w:val="2"/>
-        </w:numPr>
-      </w:pPr>
-      <w:r>
-        <w:t>Click on the green "</w:t>
-      </w:r>
-      <w:r>
-        <w:t>Create pull request</w:t>
-      </w:r>
-      <w:r>
-        <w:t xml:space="preserve">" button </w:t>
-      </w:r>
-      <w:r>
-        <w:t>located on the right of the page.</w:t>
+        <w:t>Add an appropriate title and description</w:t>
+      </w:r>
+    </w:p>
+    <w:p>
+      <w:pPr>
+        <w:pStyle w:val="ListParagraph"/>
+        <w:numPr>
+          <w:ilvl w:val="0"/>
+          <w:numId w:val="2"/>
+        </w:numPr>
+      </w:pPr>
+      <w:r>
+        <w:t>Click on the green "Create pull request" button located on the right of the page.</w:t>
       </w:r>
     </w:p>
     <w:p>
@@ -1473,16 +1291,416 @@
         <w:t xml:space="preserve"> assignment and placed in the </w:t>
       </w:r>
       <w:r>
-        <w:t>Final_Integrated</w:t>
+        <w:t xml:space="preserve">Final_Integrated </w:t>
+      </w:r>
+      <w:r>
+        <w:t>file for your team a PNG will be made by</w:t>
+      </w:r>
+      <w:r>
+        <w:t xml:space="preserve"> the assigned person by</w:t>
+      </w:r>
+      <w:r>
+        <w:t>:</w:t>
+      </w:r>
+    </w:p>
+    <w:p>
+      <w:pPr>
+        <w:pStyle w:val="ListParagraph"/>
+        <w:numPr>
+          <w:ilvl w:val="0"/>
+          <w:numId w:val="2"/>
+        </w:numPr>
+      </w:pPr>
+      <w:r>
+        <w:t>Clicking File f</w:t>
+      </w:r>
+      <w:r>
+        <w:t>ro</w:t>
+      </w:r>
+      <w:r>
+        <w:t>m the top menu</w:t>
+      </w:r>
+      <w:r>
+        <w:t xml:space="preserve"> and s</w:t>
+      </w:r>
+      <w:r>
+        <w:t>electing Export from the dropdown menu</w:t>
+      </w:r>
+    </w:p>
+    <w:p>
+      <w:pPr>
+        <w:pStyle w:val="ListParagraph"/>
+        <w:numPr>
+          <w:ilvl w:val="0"/>
+          <w:numId w:val="2"/>
+        </w:numPr>
+      </w:pPr>
+      <w:r>
+        <w:t>Selecting PNG as they type</w:t>
+      </w:r>
+    </w:p>
+    <w:p>
+      <w:pPr>
+        <w:pStyle w:val="ListParagraph"/>
+        <w:numPr>
+          <w:ilvl w:val="0"/>
+          <w:numId w:val="2"/>
+        </w:numPr>
+      </w:pPr>
+      <w:r>
+        <w:t>Clicking on the Export button in the window that pops up</w:t>
+      </w:r>
+    </w:p>
+    <w:p>
+      <w:pPr>
+        <w:pStyle w:val="ListParagraph"/>
+        <w:numPr>
+          <w:ilvl w:val="0"/>
+          <w:numId w:val="2"/>
+        </w:numPr>
+      </w:pPr>
+      <w:r>
+        <w:t xml:space="preserve">In the next window that pops up under the Where section select one of 2 </w:t>
+      </w:r>
+      <w:proofErr w:type="spellStart"/>
+      <w:r>
+        <w:t>optioins</w:t>
+      </w:r>
+      <w:proofErr w:type="spellEnd"/>
+    </w:p>
+    <w:p>
+      <w:pPr>
+        <w:pStyle w:val="ListParagraph"/>
+        <w:numPr>
+          <w:ilvl w:val="1"/>
+          <w:numId w:val="2"/>
+        </w:numPr>
+      </w:pPr>
+      <w:r>
+        <w:t xml:space="preserve">Option 1 select </w:t>
+      </w:r>
+      <w:r>
+        <w:t>Download</w:t>
       </w:r>
       <w:r>
         <w:t xml:space="preserve"> </w:t>
       </w:r>
       <w:r>
-        <w:t>file for your team a PNG will be made by</w:t>
-      </w:r>
-      <w:r>
-        <w:t xml:space="preserve"> the assigned person by</w:t>
+        <w:t>and click the OK button</w:t>
+      </w:r>
+    </w:p>
+    <w:p>
+      <w:pPr>
+        <w:pStyle w:val="ListParagraph"/>
+        <w:numPr>
+          <w:ilvl w:val="2"/>
+          <w:numId w:val="2"/>
+        </w:numPr>
+      </w:pPr>
+      <w:r>
+        <w:t xml:space="preserve">On your local system move the downloaded file from </w:t>
+      </w:r>
+      <w:r>
+        <w:t>your</w:t>
+      </w:r>
+      <w:r>
+        <w:t xml:space="preserve"> Downloads folder to the appropriate folder in the project</w:t>
+      </w:r>
+    </w:p>
+    <w:p>
+      <w:pPr>
+        <w:pStyle w:val="ListParagraph"/>
+        <w:numPr>
+          <w:ilvl w:val="2"/>
+          <w:numId w:val="2"/>
+        </w:numPr>
+      </w:pPr>
+      <w:r>
+        <w:t>Commit the changes to the repository</w:t>
+      </w:r>
+    </w:p>
+    <w:p>
+      <w:pPr>
+        <w:pStyle w:val="ListParagraph"/>
+        <w:numPr>
+          <w:ilvl w:val="1"/>
+          <w:numId w:val="2"/>
+        </w:numPr>
+      </w:pPr>
+      <w:r>
+        <w:t xml:space="preserve">Option </w:t>
+      </w:r>
+      <w:r>
+        <w:t>2</w:t>
+      </w:r>
+      <w:r>
+        <w:t xml:space="preserve"> select GitHub - Pick a folder ...</w:t>
+      </w:r>
+    </w:p>
+    <w:p>
+      <w:pPr>
+        <w:pStyle w:val="ListParagraph"/>
+        <w:numPr>
+          <w:ilvl w:val="2"/>
+          <w:numId w:val="2"/>
+        </w:numPr>
+      </w:pPr>
+      <w:r>
+        <w:t>In the window that pops up click on Authorize button with Remember me selected</w:t>
+      </w:r>
+      <w:r>
+        <w:t xml:space="preserve"> </w:t>
+      </w:r>
+      <w:r>
+        <w:rPr>
+          <w:highlight w:val="yellow"/>
+        </w:rPr>
+        <w:t>(ONLY REQUIRED THE FIRST TIME)</w:t>
+      </w:r>
+    </w:p>
+    <w:p>
+      <w:pPr>
+        <w:pStyle w:val="ListParagraph"/>
+        <w:numPr>
+          <w:ilvl w:val="2"/>
+          <w:numId w:val="2"/>
+        </w:numPr>
+      </w:pPr>
+      <w:r>
+        <w:t xml:space="preserve">In the new tab that </w:t>
+      </w:r>
+      <w:proofErr w:type="gramStart"/>
+      <w:r>
+        <w:t>opens up</w:t>
+      </w:r>
+      <w:proofErr w:type="gramEnd"/>
+      <w:r>
+        <w:t xml:space="preserve"> click the Authorize button</w:t>
+      </w:r>
+      <w:r>
+        <w:t xml:space="preserve"> </w:t>
+      </w:r>
+      <w:r>
+        <w:rPr>
+          <w:highlight w:val="yellow"/>
+        </w:rPr>
+        <w:t>(ONLY REQUIRED THE FIRST TIME)</w:t>
+      </w:r>
+    </w:p>
+    <w:p>
+      <w:pPr>
+        <w:pStyle w:val="ListParagraph"/>
+        <w:numPr>
+          <w:ilvl w:val="2"/>
+          <w:numId w:val="2"/>
+        </w:numPr>
+      </w:pPr>
+      <w:r>
+        <w:rPr>
+          <w:highlight w:val="yellow"/>
+        </w:rPr>
+        <w:t>[SKIP]</w:t>
+      </w:r>
+      <w:r>
+        <w:t xml:space="preserve"> Select </w:t>
+      </w:r>
+      <w:proofErr w:type="spellStart"/>
+      <w:r>
+        <w:t>JmmonJeremy</w:t>
+      </w:r>
+      <w:proofErr w:type="spellEnd"/>
+      <w:r>
+        <w:t>/</w:t>
+      </w:r>
+      <w:proofErr w:type="spellStart"/>
+      <w:r>
+        <w:t>CareerBound</w:t>
+      </w:r>
+      <w:proofErr w:type="spellEnd"/>
+      <w:r>
+        <w:t xml:space="preserve">-SDD and then the folders until you reach the appropriate PNG folder and </w:t>
+      </w:r>
+      <w:r>
+        <w:t>then</w:t>
+      </w:r>
+      <w:r>
+        <w:t xml:space="preserve"> click the Authorize button. In the window that pops up click the Authorize button. Then in the new tab that </w:t>
+      </w:r>
+      <w:proofErr w:type="gramStart"/>
+      <w:r>
+        <w:t>opens up</w:t>
+      </w:r>
+      <w:proofErr w:type="gramEnd"/>
+      <w:r>
+        <w:t xml:space="preserve"> click on the Install button, then change to the selection to Only select repositories &amp; select the </w:t>
+      </w:r>
+      <w:proofErr w:type="spellStart"/>
+      <w:r>
+        <w:t>JmmonJeremy</w:t>
+      </w:r>
+      <w:proofErr w:type="spellEnd"/>
+      <w:r>
+        <w:t>/</w:t>
+      </w:r>
+      <w:proofErr w:type="spellStart"/>
+      <w:r>
+        <w:t>CareerBound</w:t>
+      </w:r>
+      <w:proofErr w:type="spellEnd"/>
+      <w:r>
+        <w:t xml:space="preserve">-SDD repository. Finally, click on the Install button and then enter the password, select the Verify button and close the window. </w:t>
+      </w:r>
+      <w:r>
+        <w:rPr>
+          <w:highlight w:val="yellow"/>
+        </w:rPr>
+        <w:t>(THIS WAS ALREADY DONE BY ME FOR THE REPOSITORY)</w:t>
+      </w:r>
+    </w:p>
+    <w:p>
+      <w:pPr>
+        <w:pStyle w:val="ListParagraph"/>
+        <w:numPr>
+          <w:ilvl w:val="2"/>
+          <w:numId w:val="2"/>
+        </w:numPr>
+      </w:pPr>
+      <w:r>
+        <w:t xml:space="preserve">Select </w:t>
+      </w:r>
+      <w:proofErr w:type="spellStart"/>
+      <w:r>
+        <w:t>JmmonJeremy</w:t>
+      </w:r>
+      <w:proofErr w:type="spellEnd"/>
+      <w:r>
+        <w:t>/</w:t>
+      </w:r>
+      <w:proofErr w:type="spellStart"/>
+      <w:r>
+        <w:t>CareerBound</w:t>
+      </w:r>
+      <w:proofErr w:type="spellEnd"/>
+      <w:r>
+        <w:t xml:space="preserve">-SDD and then the folders until you reach the </w:t>
+      </w:r>
+      <w:r>
+        <w:t xml:space="preserve">appropriate </w:t>
+      </w:r>
+      <w:r>
+        <w:t>PNG</w:t>
+      </w:r>
+      <w:r>
+        <w:t xml:space="preserve"> folder and </w:t>
+      </w:r>
+      <w:r>
+        <w:t>then</w:t>
+      </w:r>
+      <w:r>
+        <w:t xml:space="preserve"> click the OK button </w:t>
+      </w:r>
+      <w:r>
+        <w:rPr>
+          <w:highlight w:val="yellow"/>
+        </w:rPr>
+        <w:t>(THIS FOLDER WILL PERMANENTLY BE ADDED AS AN OPTION IN THE DROPDOWN LIST AFTER THE FIRST TIME)</w:t>
+      </w:r>
+    </w:p>
+    <w:p>
+      <w:pPr>
+        <w:pStyle w:val="ListParagraph"/>
+        <w:numPr>
+          <w:ilvl w:val="2"/>
+          <w:numId w:val="2"/>
+        </w:numPr>
+      </w:pPr>
+      <w:r>
+        <w:t>In the window that pops up</w:t>
+      </w:r>
+      <w:r>
+        <w:t xml:space="preserve"> </w:t>
+      </w:r>
+      <w:r>
+        <w:t>click the Save button</w:t>
+      </w:r>
+      <w:r>
+        <w:t>.</w:t>
+      </w:r>
+    </w:p>
+    <w:p>
+      <w:pPr>
+        <w:pStyle w:val="ListParagraph"/>
+        <w:numPr>
+          <w:ilvl w:val="2"/>
+          <w:numId w:val="2"/>
+        </w:numPr>
+      </w:pPr>
+      <w:r>
+        <w:t>In the window that pops up add your commit message and click the OK button</w:t>
+      </w:r>
+    </w:p>
+    <w:p>
+      <w:pPr>
+        <w:pStyle w:val="ListParagraph"/>
+        <w:numPr>
+          <w:ilvl w:val="0"/>
+          <w:numId w:val="7"/>
+        </w:numPr>
+      </w:pPr>
+      <w:r>
+        <w:t xml:space="preserve">The PNG will be </w:t>
+      </w:r>
+      <w:r>
+        <w:t>past</w:t>
+      </w:r>
+      <w:r>
+        <w:t xml:space="preserve">ed into the final document. </w:t>
+      </w:r>
+    </w:p>
+    <w:p>
+      <w:pPr>
+        <w:pStyle w:val="Sub-Info"/>
+        <w:rPr>
+          <w:rFonts w:eastAsia="Times New Roman"/>
+        </w:rPr>
+      </w:pPr>
+      <w:r>
+        <w:rPr>
+          <w:rFonts w:eastAsia="Times New Roman"/>
+        </w:rPr>
+        <w:t>SharePoint</w:t>
+      </w:r>
+    </w:p>
+    <w:p>
+      <w:pPr>
+        <w:pStyle w:val="ListParagraph"/>
+        <w:numPr>
+          <w:ilvl w:val="0"/>
+          <w:numId w:val="10"/>
+        </w:numPr>
+      </w:pPr>
+      <w:r>
+        <w:t>The OneDrive with our BYUI SharePoint account will be used to store Word documents you are working on.</w:t>
+      </w:r>
+    </w:p>
+    <w:p>
+      <w:pPr>
+        <w:pStyle w:val="ListParagraph"/>
+        <w:numPr>
+          <w:ilvl w:val="0"/>
+          <w:numId w:val="10"/>
+        </w:numPr>
+      </w:pPr>
+      <w:r>
+        <w:t xml:space="preserve">To create a folder to store documents for our </w:t>
+      </w:r>
+      <w:proofErr w:type="spellStart"/>
+      <w:r>
+        <w:t>CareerBound</w:t>
+      </w:r>
+      <w:proofErr w:type="spellEnd"/>
+      <w:r>
+        <w:t xml:space="preserve"> SDD project in this class</w:t>
       </w:r>
       <w:r>
         <w:t>:</w:t>
@@ -1497,333 +1715,16 @@
         </w:numPr>
       </w:pPr>
       <w:r>
-        <w:t>Clicking File f</w:t>
-      </w:r>
-      <w:r>
-        <w:t>ro</w:t>
-      </w:r>
-      <w:r>
-        <w:t>m the top menu</w:t>
-      </w:r>
-      <w:r>
-        <w:t xml:space="preserve"> and s</w:t>
-      </w:r>
-      <w:r>
-        <w:t>electing Export from the dropdown menu</w:t>
-      </w:r>
-    </w:p>
-    <w:p>
-      <w:pPr>
-        <w:pStyle w:val="ListParagraph"/>
-        <w:numPr>
-          <w:ilvl w:val="0"/>
-          <w:numId w:val="2"/>
-        </w:numPr>
-      </w:pPr>
-      <w:r>
-        <w:t>Selecting PNG as they type</w:t>
-      </w:r>
-    </w:p>
-    <w:p>
-      <w:pPr>
-        <w:pStyle w:val="ListParagraph"/>
-        <w:numPr>
-          <w:ilvl w:val="0"/>
-          <w:numId w:val="2"/>
-        </w:numPr>
-      </w:pPr>
-      <w:r>
-        <w:t>Clicking on the Export button in the window that pops up</w:t>
-      </w:r>
-    </w:p>
-    <w:p>
-      <w:pPr>
-        <w:pStyle w:val="ListParagraph"/>
-        <w:numPr>
-          <w:ilvl w:val="0"/>
-          <w:numId w:val="2"/>
-        </w:numPr>
-      </w:pPr>
-      <w:r>
-        <w:t xml:space="preserve">In the next window that pops up under the Where section select one of 2 </w:t>
-      </w:r>
-      <w:proofErr w:type="spellStart"/>
-      <w:r>
-        <w:t>optioins</w:t>
-      </w:r>
-      <w:proofErr w:type="spellEnd"/>
-    </w:p>
-    <w:p>
-      <w:pPr>
-        <w:pStyle w:val="ListParagraph"/>
-        <w:numPr>
-          <w:ilvl w:val="1"/>
-          <w:numId w:val="2"/>
-        </w:numPr>
-      </w:pPr>
-      <w:r>
-        <w:t xml:space="preserve">Option 1 select </w:t>
-      </w:r>
-      <w:r>
-        <w:t>Download</w:t>
-      </w:r>
-      <w:r>
-        <w:t xml:space="preserve"> </w:t>
-      </w:r>
-      <w:r>
-        <w:t>and click the OK button</w:t>
-      </w:r>
-    </w:p>
-    <w:p>
-      <w:pPr>
-        <w:pStyle w:val="ListParagraph"/>
-        <w:numPr>
-          <w:ilvl w:val="2"/>
-          <w:numId w:val="2"/>
-        </w:numPr>
-      </w:pPr>
-      <w:r>
-        <w:t xml:space="preserve">On your local system move the downloaded file from </w:t>
-      </w:r>
-      <w:r>
-        <w:t>your</w:t>
-      </w:r>
-      <w:r>
-        <w:t xml:space="preserve"> Downloads folder to the appropriate folder in the project</w:t>
-      </w:r>
-    </w:p>
-    <w:p>
-      <w:pPr>
-        <w:pStyle w:val="ListParagraph"/>
-        <w:numPr>
-          <w:ilvl w:val="2"/>
-          <w:numId w:val="2"/>
-        </w:numPr>
-      </w:pPr>
-      <w:r>
-        <w:t>Commit the changes to the repository</w:t>
-      </w:r>
-    </w:p>
-    <w:p>
-      <w:pPr>
-        <w:pStyle w:val="ListParagraph"/>
-        <w:numPr>
-          <w:ilvl w:val="1"/>
-          <w:numId w:val="2"/>
-        </w:numPr>
-      </w:pPr>
-      <w:r>
-        <w:t xml:space="preserve">Option </w:t>
-      </w:r>
-      <w:r>
-        <w:t>2</w:t>
-      </w:r>
-      <w:r>
-        <w:t xml:space="preserve"> select GitHub - Pick a folder ...</w:t>
-      </w:r>
-    </w:p>
-    <w:p>
-      <w:pPr>
-        <w:pStyle w:val="ListParagraph"/>
-        <w:numPr>
-          <w:ilvl w:val="2"/>
-          <w:numId w:val="2"/>
-        </w:numPr>
-      </w:pPr>
-      <w:r>
-        <w:t>In the window that pops up click on Authorize button with Remember me selected</w:t>
-      </w:r>
-      <w:r>
-        <w:t xml:space="preserve"> </w:t>
-      </w:r>
-      <w:r>
-        <w:rPr>
-          <w:highlight w:val="yellow"/>
-        </w:rPr>
-        <w:t>(ONLY REQUIRED THE FIRST TIME)</w:t>
-      </w:r>
-    </w:p>
-    <w:p>
-      <w:pPr>
-        <w:pStyle w:val="ListParagraph"/>
-        <w:numPr>
-          <w:ilvl w:val="2"/>
-          <w:numId w:val="2"/>
-        </w:numPr>
-      </w:pPr>
-      <w:r>
-        <w:t xml:space="preserve">In the new tab that </w:t>
-      </w:r>
-      <w:proofErr w:type="gramStart"/>
-      <w:r>
-        <w:t>opens up</w:t>
-      </w:r>
-      <w:proofErr w:type="gramEnd"/>
-      <w:r>
-        <w:t xml:space="preserve"> click the Authorize button</w:t>
-      </w:r>
-      <w:r>
-        <w:t xml:space="preserve"> </w:t>
-      </w:r>
-      <w:r>
-        <w:rPr>
-          <w:highlight w:val="yellow"/>
-        </w:rPr>
-        <w:t>(ONLY REQUIRED THE FIRST TIME)</w:t>
-      </w:r>
-    </w:p>
-    <w:p>
-      <w:pPr>
-        <w:pStyle w:val="ListParagraph"/>
-        <w:numPr>
-          <w:ilvl w:val="2"/>
-          <w:numId w:val="2"/>
-        </w:numPr>
-      </w:pPr>
-      <w:r>
-        <w:rPr>
-          <w:highlight w:val="yellow"/>
-        </w:rPr>
-        <w:t>[SKIP]</w:t>
-      </w:r>
-      <w:r>
-        <w:t xml:space="preserve"> Select </w:t>
-      </w:r>
-      <w:proofErr w:type="spellStart"/>
-      <w:r>
-        <w:t>JmmonJeremy</w:t>
-      </w:r>
-      <w:proofErr w:type="spellEnd"/>
-      <w:r>
-        <w:t>/</w:t>
-      </w:r>
-      <w:proofErr w:type="spellStart"/>
-      <w:r>
-        <w:t>CareerBound</w:t>
-      </w:r>
-      <w:proofErr w:type="spellEnd"/>
-      <w:r>
-        <w:t xml:space="preserve">-SDD and then the folders until you reach the appropriate PNG folder and </w:t>
-      </w:r>
-      <w:r>
-        <w:t>then</w:t>
-      </w:r>
-      <w:r>
-        <w:t xml:space="preserve"> click the </w:t>
-      </w:r>
-      <w:r>
-        <w:t>Authorize</w:t>
-      </w:r>
-      <w:r>
-        <w:t xml:space="preserve"> button</w:t>
-      </w:r>
-      <w:r>
-        <w:t xml:space="preserve">. </w:t>
-      </w:r>
-      <w:proofErr w:type="gramStart"/>
-      <w:r>
-        <w:t>In</w:t>
-      </w:r>
-      <w:proofErr w:type="gramEnd"/>
-      <w:r>
-        <w:t xml:space="preserve"> the window that pops up click the Authorize button. Then in the new tab that </w:t>
-      </w:r>
-      <w:proofErr w:type="gramStart"/>
-      <w:r>
-        <w:t>opens up</w:t>
-      </w:r>
-      <w:proofErr w:type="gramEnd"/>
-      <w:r>
-        <w:t xml:space="preserve"> click on the Install button, then change to the selection to Only select repositories &amp; select the </w:t>
-      </w:r>
-      <w:proofErr w:type="spellStart"/>
-      <w:r>
-        <w:t>JmmonJeremy</w:t>
-      </w:r>
-      <w:proofErr w:type="spellEnd"/>
-      <w:r>
-        <w:t>/</w:t>
-      </w:r>
-      <w:proofErr w:type="spellStart"/>
-      <w:r>
-        <w:t>CareerBound</w:t>
-      </w:r>
-      <w:proofErr w:type="spellEnd"/>
-      <w:r>
-        <w:t xml:space="preserve">-SDD repository. Finally, click on the Install button and then enter the password, select the Verify button and close the window. </w:t>
-      </w:r>
-      <w:r>
-        <w:rPr>
-          <w:highlight w:val="yellow"/>
-        </w:rPr>
-        <w:t>(THIS WAS ALREADY DONE BY ME FOR THE REPOSITORY)</w:t>
-      </w:r>
-    </w:p>
-    <w:p>
-      <w:pPr>
-        <w:pStyle w:val="ListParagraph"/>
-        <w:numPr>
-          <w:ilvl w:val="2"/>
-          <w:numId w:val="2"/>
-        </w:numPr>
-      </w:pPr>
-      <w:r>
-        <w:t xml:space="preserve">Select </w:t>
-      </w:r>
-      <w:proofErr w:type="spellStart"/>
-      <w:r>
-        <w:t>JmmonJeremy</w:t>
-      </w:r>
-      <w:proofErr w:type="spellEnd"/>
-      <w:r>
-        <w:t>/</w:t>
-      </w:r>
-      <w:proofErr w:type="spellStart"/>
-      <w:r>
-        <w:t>CareerBound</w:t>
-      </w:r>
-      <w:proofErr w:type="spellEnd"/>
-      <w:r>
-        <w:t xml:space="preserve">-SDD and then the folders until you reach the </w:t>
-      </w:r>
-      <w:r>
-        <w:t xml:space="preserve">appropriate </w:t>
-      </w:r>
-      <w:r>
-        <w:t>PNG</w:t>
-      </w:r>
-      <w:r>
-        <w:t xml:space="preserve"> folder and </w:t>
-      </w:r>
-      <w:r>
-        <w:t>then</w:t>
-      </w:r>
-      <w:r>
-        <w:t xml:space="preserve"> click the OK button </w:t>
-      </w:r>
-      <w:r>
-        <w:rPr>
-          <w:highlight w:val="yellow"/>
-        </w:rPr>
-        <w:t>(THIS FOLDER WILL PERMANENTLY BE ADDED AS AN OPTION IN THE DROPDOWN LIST AFTER THE FIRST TIME)</w:t>
-      </w:r>
-    </w:p>
-    <w:p>
-      <w:pPr>
-        <w:pStyle w:val="ListParagraph"/>
-        <w:numPr>
-          <w:ilvl w:val="2"/>
-          <w:numId w:val="2"/>
-        </w:numPr>
-      </w:pPr>
-      <w:r>
-        <w:t>In the window that pops up</w:t>
-      </w:r>
-      <w:r>
-        <w:t xml:space="preserve"> </w:t>
-      </w:r>
-      <w:r>
-        <w:t>click the Save button</w:t>
+        <w:t>C</w:t>
+      </w:r>
+      <w:r>
+        <w:t xml:space="preserve">lick on the blue button with rounded corners that says + Create or upload </w:t>
+      </w:r>
+      <w:r>
+        <w:t xml:space="preserve">located </w:t>
+      </w:r>
+      <w:r>
+        <w:t>in the top right-hand corner</w:t>
       </w:r>
       <w:r>
         <w:t>.</w:t>
@@ -1833,44 +1734,30 @@
       <w:pPr>
         <w:pStyle w:val="ListParagraph"/>
         <w:numPr>
-          <w:ilvl w:val="2"/>
-          <w:numId w:val="2"/>
-        </w:numPr>
-      </w:pPr>
-      <w:r>
-        <w:t>In the window that pops up add your commit message and click the OK button</w:t>
-      </w:r>
-    </w:p>
-    <w:p>
-      <w:pPr>
-        <w:pStyle w:val="ListParagraph"/>
-        <w:numPr>
-          <w:ilvl w:val="0"/>
-          <w:numId w:val="7"/>
-        </w:numPr>
-      </w:pPr>
-      <w:r>
-        <w:t xml:space="preserve">The PNG will be </w:t>
-      </w:r>
-      <w:r>
-        <w:t>past</w:t>
-      </w:r>
-      <w:r>
-        <w:t xml:space="preserve">ed into the final document. </w:t>
-      </w:r>
-    </w:p>
-    <w:p>
-      <w:pPr>
-        <w:pStyle w:val="Sub-Info"/>
-        <w:rPr>
-          <w:rFonts w:eastAsia="Times New Roman"/>
-        </w:rPr>
-      </w:pPr>
-      <w:r>
-        <w:rPr>
-          <w:rFonts w:eastAsia="Times New Roman"/>
-        </w:rPr>
-        <w:t>SharePoint</w:t>
+          <w:ilvl w:val="0"/>
+          <w:numId w:val="2"/>
+        </w:numPr>
+      </w:pPr>
+      <w:r>
+        <w:t>Select the Folder option at the top of the dropdown menu</w:t>
+      </w:r>
+      <w:r>
+        <w:t>.</w:t>
+      </w:r>
+    </w:p>
+    <w:p>
+      <w:pPr>
+        <w:pStyle w:val="ListParagraph"/>
+        <w:numPr>
+          <w:ilvl w:val="0"/>
+          <w:numId w:val="2"/>
+        </w:numPr>
+      </w:pPr>
+      <w:r>
+        <w:t>Name and color your folder as desired and click the Create button</w:t>
+      </w:r>
+      <w:r>
+        <w:t>.</w:t>
       </w:r>
     </w:p>
     <w:p>
@@ -1882,105 +1769,7 @@
         </w:numPr>
       </w:pPr>
       <w:r>
-        <w:t>The OneDrive with our BYUI SharePoint account will be used to store Word documents you are working on.</w:t>
-      </w:r>
-    </w:p>
-    <w:p>
-      <w:pPr>
-        <w:pStyle w:val="ListParagraph"/>
-        <w:numPr>
-          <w:ilvl w:val="0"/>
-          <w:numId w:val="10"/>
-        </w:numPr>
-      </w:pPr>
-      <w:r>
-        <w:t xml:space="preserve">To create a folder to store documents for our </w:t>
-      </w:r>
-      <w:proofErr w:type="spellStart"/>
-      <w:r>
-        <w:t>CareerBound</w:t>
-      </w:r>
-      <w:proofErr w:type="spellEnd"/>
-      <w:r>
-        <w:t xml:space="preserve"> </w:t>
-      </w:r>
-      <w:r>
-        <w:t>SDD</w:t>
-      </w:r>
-      <w:r>
-        <w:t xml:space="preserve"> project in this class</w:t>
-      </w:r>
-      <w:r>
-        <w:t>:</w:t>
-      </w:r>
-    </w:p>
-    <w:p>
-      <w:pPr>
-        <w:pStyle w:val="ListParagraph"/>
-        <w:numPr>
-          <w:ilvl w:val="0"/>
-          <w:numId w:val="2"/>
-        </w:numPr>
-      </w:pPr>
-      <w:r>
-        <w:t>C</w:t>
-      </w:r>
-      <w:r>
-        <w:t xml:space="preserve">lick on the blue button with rounded corners that says + Create or upload </w:t>
-      </w:r>
-      <w:r>
-        <w:t xml:space="preserve">located </w:t>
-      </w:r>
-      <w:r>
-        <w:t>in the top right-hand corner</w:t>
-      </w:r>
-      <w:r>
-        <w:t>.</w:t>
-      </w:r>
-    </w:p>
-    <w:p>
-      <w:pPr>
-        <w:pStyle w:val="ListParagraph"/>
-        <w:numPr>
-          <w:ilvl w:val="0"/>
-          <w:numId w:val="2"/>
-        </w:numPr>
-      </w:pPr>
-      <w:r>
-        <w:t>Select the Folder option at the top of the dropdown menu</w:t>
-      </w:r>
-      <w:r>
-        <w:t>.</w:t>
-      </w:r>
-    </w:p>
-    <w:p>
-      <w:pPr>
-        <w:pStyle w:val="ListParagraph"/>
-        <w:numPr>
-          <w:ilvl w:val="0"/>
-          <w:numId w:val="2"/>
-        </w:numPr>
-      </w:pPr>
-      <w:r>
-        <w:t>Name and color your folder as desired and click the Create button</w:t>
-      </w:r>
-      <w:r>
-        <w:t>.</w:t>
-      </w:r>
-    </w:p>
-    <w:p>
-      <w:pPr>
-        <w:pStyle w:val="ListParagraph"/>
-        <w:numPr>
-          <w:ilvl w:val="0"/>
-          <w:numId w:val="10"/>
-        </w:numPr>
-      </w:pPr>
-      <w:r>
-        <w:t xml:space="preserve">To access the folder </w:t>
-      </w:r>
-      <w:r>
-        <w:t xml:space="preserve">for our </w:t>
+        <w:t xml:space="preserve">To access the folder for our </w:t>
       </w:r>
       <w:proofErr w:type="spellStart"/>
       <w:r>
@@ -2076,13 +1865,7 @@
         </w:numPr>
       </w:pPr>
       <w:r>
-        <w:t>Select the F</w:t>
-      </w:r>
-      <w:r>
-        <w:t>iles upload</w:t>
-      </w:r>
-      <w:r>
-        <w:t xml:space="preserve"> option at the top of the dropdown menu</w:t>
+        <w:t>Select the Files upload option at the top of the dropdown menu</w:t>
       </w:r>
       <w:r>
         <w:t>.</w:t>
@@ -2118,40 +1901,19 @@
         <w:t xml:space="preserve"> </w:t>
       </w:r>
       <w:r>
-        <w:t xml:space="preserve">your OneDrive </w:t>
-      </w:r>
-      <w:r>
-        <w:t xml:space="preserve">folder </w:t>
-      </w:r>
-      <w:r>
-        <w:t>in SharePo</w:t>
-      </w:r>
-      <w:r>
-        <w:t>i</w:t>
-      </w:r>
-      <w:r>
-        <w:t>nt</w:t>
-      </w:r>
-      <w:r>
-        <w:t>:</w:t>
-      </w:r>
-    </w:p>
-    <w:p>
-      <w:pPr>
-        <w:pStyle w:val="ListParagraph"/>
-        <w:numPr>
-          <w:ilvl w:val="0"/>
-          <w:numId w:val="2"/>
-        </w:numPr>
-      </w:pPr>
-      <w:r>
-        <w:t xml:space="preserve">Go to your folder </w:t>
-      </w:r>
-      <w:r>
-        <w:t>in your OneDrive in SharePoint</w:t>
-      </w:r>
-      <w:r>
-        <w:t>.</w:t>
+        <w:t>your OneDrive folder in SharePoint:</w:t>
+      </w:r>
+    </w:p>
+    <w:p>
+      <w:pPr>
+        <w:pStyle w:val="ListParagraph"/>
+        <w:numPr>
+          <w:ilvl w:val="0"/>
+          <w:numId w:val="2"/>
+        </w:numPr>
+      </w:pPr>
+      <w:r>
+        <w:t>Go to your folder in your OneDrive in SharePoint.</w:t>
       </w:r>
     </w:p>
     <w:p>
@@ -2199,20 +1961,11 @@
         </w:numPr>
       </w:pPr>
       <w:r>
-        <w:t xml:space="preserve">Go into the folder you want the </w:t>
-      </w:r>
-      <w:r>
-        <w:t xml:space="preserve">documents </w:t>
-      </w:r>
-      <w:r>
-        <w:t xml:space="preserve">to </w:t>
+        <w:t xml:space="preserve">Go into the folder you want the documents to </w:t>
       </w:r>
       <w:proofErr w:type="gramStart"/>
       <w:r>
-        <w:t xml:space="preserve">be located </w:t>
-      </w:r>
-      <w:r>
-        <w:t>in</w:t>
+        <w:t>be located in</w:t>
       </w:r>
       <w:proofErr w:type="gramEnd"/>
       <w:r>
@@ -2240,22 +1993,13 @@
         </w:numPr>
       </w:pPr>
       <w:r>
-        <w:t xml:space="preserve">Select the </w:t>
-      </w:r>
-      <w:r>
-        <w:t xml:space="preserve">Word </w:t>
+        <w:t xml:space="preserve">Select the Word </w:t>
       </w:r>
       <w:r>
         <w:t>document</w:t>
       </w:r>
       <w:r>
-        <w:t xml:space="preserve"> option </w:t>
-      </w:r>
-      <w:r>
-        <w:t>from</w:t>
-      </w:r>
-      <w:r>
-        <w:t xml:space="preserve"> the dropdown menu.</w:t>
+        <w:t xml:space="preserve"> option from the dropdown menu.</w:t>
       </w:r>
     </w:p>
     <w:p>
@@ -2467,10 +2211,7 @@
         </w:numPr>
       </w:pPr>
       <w:r>
-        <w:t xml:space="preserve">While in the Word document window select the Share dropdown menu located </w:t>
-      </w:r>
-      <w:r>
-        <w:t>on the top left-hand side of the window.</w:t>
+        <w:t>While in the Word document window select the Share dropdown menu located on the top left-hand side of the window.</w:t>
       </w:r>
     </w:p>
     <w:p>
@@ -2512,19 +2253,7 @@
         </w:numPr>
       </w:pPr>
       <w:r>
-        <w:t xml:space="preserve">Option </w:t>
-      </w:r>
-      <w:r>
-        <w:t>2</w:t>
-      </w:r>
-      <w:r>
-        <w:t xml:space="preserve"> - from the </w:t>
-      </w:r>
-      <w:r>
-        <w:t xml:space="preserve">Folder containing the </w:t>
-      </w:r>
-      <w:r>
-        <w:t>Word document:</w:t>
+        <w:t>Option 2 - from the Folder containing the Word document:</w:t>
       </w:r>
     </w:p>
     <w:p>
@@ -2674,13 +2403,7 @@
         </w:numPr>
       </w:pPr>
       <w:r>
-        <w:t xml:space="preserve">Now you can both open the document and work on it together and you will see each other's </w:t>
-      </w:r>
-      <w:r>
-        <w:t>names at the top</w:t>
-      </w:r>
-      <w:r>
-        <w:t>, colored cursors, and edits will appear in real time.</w:t>
+        <w:t>Now you can both open the document and work on it together and you will see each other's names at the top, colored cursors, and edits will appear in real time.</w:t>
       </w:r>
     </w:p>
     <w:p>
@@ -2903,10 +2626,7 @@
         </w:numPr>
       </w:pPr>
       <w:r>
-        <w:t xml:space="preserve">From the dropdown menu select </w:t>
-      </w:r>
-      <w:r>
-        <w:t>Watch</w:t>
+        <w:t>From the dropdown menu select Watch</w:t>
       </w:r>
     </w:p>
     <w:p>

</xml_diff>

<commit_message>
Made updates to tracking Board tool in the documents
</commit_message>
<xml_diff>
--- a/01_Standards/Required_Tools_&_Their_Workflow.docx
+++ b/01_Standards/Required_Tools_&_Their_Workflow.docx
@@ -323,6 +323,26 @@
         </w:rPr>
         <w:t xml:space="preserve">Trello </w:t>
       </w:r>
+      <w:proofErr w:type="gramStart"/>
+      <w:r>
+        <w:rPr>
+          <w:rFonts w:eastAsia="Times New Roman" w:cs="Times New Roman"/>
+          <w:b/>
+          <w:bCs/>
+          <w:color w:val="BF4E14" w:themeColor="accent2" w:themeShade="BF"/>
+        </w:rPr>
+        <w:t>like</w:t>
+      </w:r>
+      <w:proofErr w:type="gramEnd"/>
+      <w:r>
+        <w:rPr>
+          <w:rFonts w:eastAsia="Times New Roman" w:cs="Times New Roman"/>
+          <w:b/>
+          <w:bCs/>
+          <w:color w:val="BF4E14" w:themeColor="accent2" w:themeShade="BF"/>
+        </w:rPr>
+        <w:t xml:space="preserve"> Teams Planner Board</w:t>
+      </w:r>
       <w:r>
         <w:rPr>
           <w:rFonts w:ascii="Times New Roman" w:eastAsia="Times New Roman" w:hAnsi="Times New Roman" w:cs="Times New Roman"/>
@@ -333,19 +353,19 @@
         <w:rPr>
           <w:rFonts w:eastAsia="Times New Roman" w:cs="Times New Roman"/>
         </w:rPr>
-        <w:t xml:space="preserve"> </w:t>
+        <w:t xml:space="preserve"> assignments + status tracking (</w:t>
       </w:r>
       <w:r>
         <w:rPr>
           <w:rFonts w:eastAsia="Times New Roman" w:cs="Times New Roman"/>
         </w:rPr>
-        <w:t>assignments + status tracking (</w:t>
+        <w:t>Part of Teams General Channel</w:t>
       </w:r>
       <w:r>
         <w:rPr>
           <w:rFonts w:eastAsia="Times New Roman" w:cs="Times New Roman"/>
         </w:rPr>
-        <w:t xml:space="preserve">Click the Link. Sign in using your BYUI email. </w:t>
+        <w:t xml:space="preserve">. </w:t>
       </w:r>
       <w:r>
         <w:rPr>
@@ -353,20 +373,27 @@
         </w:rPr>
         <w:t xml:space="preserve">Link: </w:t>
       </w:r>
-      <w:hyperlink r:id="rId10" w:history="1">
+      <w:hyperlink r:id="rId10" w:tooltip="https://teams.microsoft.com/l/entity/com.microsoft.teamspace.tab.planner/_djb2_msteams_prefix_4017385990?context=%7B%22channelId%22%3A%2219%3Ad8pFcXWYsE-Es9WJSnScm6r1CQZ21Ad63NXz8YjLgUQ1%40thread.tacv2%22%7D&amp;tenantId=e6ac1d1f-d695-4ef1-91d4-94cddef8be11" w:history="1">
+        <w:proofErr w:type="spellStart"/>
         <w:r>
           <w:rPr>
             <w:rStyle w:val="Hyperlink"/>
-            <w:rFonts w:eastAsia="Times New Roman" w:cs="Times New Roman"/>
           </w:rPr>
-          <w:t>https://trello.com/b/TZn4KFEu/careerbound-sdd</w:t>
+          <w:t>CareerBound</w:t>
+        </w:r>
+        <w:proofErr w:type="spellEnd"/>
+        <w:r>
+          <w:rPr>
+            <w:rStyle w:val="Hyperlink"/>
+          </w:rPr>
+          <w:t xml:space="preserve"> SDD Task Tracker</w:t>
         </w:r>
       </w:hyperlink>
       <w:r>
         <w:rPr>
           <w:rFonts w:eastAsia="Times New Roman" w:cs="Times New Roman"/>
         </w:rPr>
-        <w:t xml:space="preserve"> - For this to work you must accept the invite I sent you in your BYUI email)</w:t>
+        <w:t>)</w:t>
       </w:r>
       <w:r>
         <w:rPr>
@@ -805,19 +832,19 @@
         </w:numPr>
       </w:pPr>
       <w:r>
+        <w:t>Create/choose a folder to house the repo locally on your system (I would give the folder the same name as the repo, but that's up to you)</w:t>
+      </w:r>
+    </w:p>
+    <w:p>
+      <w:pPr>
+        <w:pStyle w:val="ListParagraph"/>
+        <w:numPr>
+          <w:ilvl w:val="1"/>
+          <w:numId w:val="2"/>
+        </w:numPr>
+      </w:pPr>
+      <w:r>
         <w:lastRenderedPageBreak/>
-        <w:t>Create/choose a folder to house the repo locally on your system (I would give the folder the same name as the repo, but that's up to you)</w:t>
-      </w:r>
-    </w:p>
-    <w:p>
-      <w:pPr>
-        <w:pStyle w:val="ListParagraph"/>
-        <w:numPr>
-          <w:ilvl w:val="1"/>
-          <w:numId w:val="2"/>
-        </w:numPr>
-      </w:pPr>
-      <w:r>
         <w:t>In VS Code press Ctrl + Shift + P, type: Git: Clone</w:t>
       </w:r>
     </w:p>
@@ -1275,29 +1302,432 @@
         </w:numPr>
       </w:pPr>
       <w:r>
+        <w:t xml:space="preserve">After a </w:t>
+      </w:r>
+      <w:r>
+        <w:t>team's</w:t>
+      </w:r>
+      <w:r>
+        <w:t xml:space="preserve"> work has been integrated into their </w:t>
+      </w:r>
+      <w:r>
+        <w:t>team's</w:t>
+      </w:r>
+      <w:r>
+        <w:t xml:space="preserve"> assignment and placed in the </w:t>
+      </w:r>
+      <w:r>
+        <w:t xml:space="preserve">Final_Integrated </w:t>
+      </w:r>
+      <w:r>
+        <w:t>file for your team a PNG will be made by</w:t>
+      </w:r>
+      <w:r>
+        <w:t xml:space="preserve"> the assigned person by</w:t>
+      </w:r>
+      <w:r>
+        <w:t>:</w:t>
+      </w:r>
+    </w:p>
+    <w:p>
+      <w:pPr>
+        <w:pStyle w:val="ListParagraph"/>
+        <w:numPr>
+          <w:ilvl w:val="0"/>
+          <w:numId w:val="2"/>
+        </w:numPr>
+      </w:pPr>
+      <w:r>
+        <w:t>Clicking File f</w:t>
+      </w:r>
+      <w:r>
+        <w:t>ro</w:t>
+      </w:r>
+      <w:r>
+        <w:t>m the top menu</w:t>
+      </w:r>
+      <w:r>
+        <w:t xml:space="preserve"> and s</w:t>
+      </w:r>
+      <w:r>
+        <w:t>electing Export from the dropdown menu</w:t>
+      </w:r>
+    </w:p>
+    <w:p>
+      <w:pPr>
+        <w:pStyle w:val="ListParagraph"/>
+        <w:numPr>
+          <w:ilvl w:val="0"/>
+          <w:numId w:val="2"/>
+        </w:numPr>
+      </w:pPr>
+      <w:r>
         <w:lastRenderedPageBreak/>
-        <w:t xml:space="preserve">After a </w:t>
-      </w:r>
-      <w:r>
-        <w:t>team's</w:t>
-      </w:r>
-      <w:r>
-        <w:t xml:space="preserve"> work has been integrated into their </w:t>
-      </w:r>
-      <w:r>
-        <w:t>team's</w:t>
-      </w:r>
-      <w:r>
-        <w:t xml:space="preserve"> assignment and placed in the </w:t>
-      </w:r>
-      <w:r>
-        <w:t xml:space="preserve">Final_Integrated </w:t>
-      </w:r>
-      <w:r>
-        <w:t>file for your team a PNG will be made by</w:t>
-      </w:r>
-      <w:r>
-        <w:t xml:space="preserve"> the assigned person by</w:t>
+        <w:t>Selecting PNG as they type</w:t>
+      </w:r>
+    </w:p>
+    <w:p>
+      <w:pPr>
+        <w:pStyle w:val="ListParagraph"/>
+        <w:numPr>
+          <w:ilvl w:val="0"/>
+          <w:numId w:val="2"/>
+        </w:numPr>
+      </w:pPr>
+      <w:r>
+        <w:t>Clicking on the Export button in the window that pops up</w:t>
+      </w:r>
+    </w:p>
+    <w:p>
+      <w:pPr>
+        <w:pStyle w:val="ListParagraph"/>
+        <w:numPr>
+          <w:ilvl w:val="0"/>
+          <w:numId w:val="2"/>
+        </w:numPr>
+      </w:pPr>
+      <w:r>
+        <w:t xml:space="preserve">In the next window that pops up under the Where section select one of 2 </w:t>
+      </w:r>
+      <w:proofErr w:type="spellStart"/>
+      <w:r>
+        <w:t>optioins</w:t>
+      </w:r>
+      <w:proofErr w:type="spellEnd"/>
+    </w:p>
+    <w:p>
+      <w:pPr>
+        <w:pStyle w:val="ListParagraph"/>
+        <w:numPr>
+          <w:ilvl w:val="1"/>
+          <w:numId w:val="2"/>
+        </w:numPr>
+      </w:pPr>
+      <w:r>
+        <w:t xml:space="preserve">Option 1 select </w:t>
+      </w:r>
+      <w:r>
+        <w:t>Download</w:t>
+      </w:r>
+      <w:r>
+        <w:t xml:space="preserve"> </w:t>
+      </w:r>
+      <w:r>
+        <w:t>and click the OK button</w:t>
+      </w:r>
+    </w:p>
+    <w:p>
+      <w:pPr>
+        <w:pStyle w:val="ListParagraph"/>
+        <w:numPr>
+          <w:ilvl w:val="2"/>
+          <w:numId w:val="2"/>
+        </w:numPr>
+      </w:pPr>
+      <w:r>
+        <w:t xml:space="preserve">On your local system move the downloaded file from </w:t>
+      </w:r>
+      <w:r>
+        <w:t>your</w:t>
+      </w:r>
+      <w:r>
+        <w:t xml:space="preserve"> Downloads folder to the appropriate folder in the project</w:t>
+      </w:r>
+    </w:p>
+    <w:p>
+      <w:pPr>
+        <w:pStyle w:val="ListParagraph"/>
+        <w:numPr>
+          <w:ilvl w:val="2"/>
+          <w:numId w:val="2"/>
+        </w:numPr>
+      </w:pPr>
+      <w:r>
+        <w:t>Commit the changes to the repository</w:t>
+      </w:r>
+    </w:p>
+    <w:p>
+      <w:pPr>
+        <w:pStyle w:val="ListParagraph"/>
+        <w:numPr>
+          <w:ilvl w:val="1"/>
+          <w:numId w:val="2"/>
+        </w:numPr>
+      </w:pPr>
+      <w:r>
+        <w:t xml:space="preserve">Option </w:t>
+      </w:r>
+      <w:r>
+        <w:t>2</w:t>
+      </w:r>
+      <w:r>
+        <w:t xml:space="preserve"> select GitHub - Pick a folder ...</w:t>
+      </w:r>
+    </w:p>
+    <w:p>
+      <w:pPr>
+        <w:pStyle w:val="ListParagraph"/>
+        <w:numPr>
+          <w:ilvl w:val="2"/>
+          <w:numId w:val="2"/>
+        </w:numPr>
+      </w:pPr>
+      <w:r>
+        <w:t>In the window that pops up click on Authorize button with Remember me selected</w:t>
+      </w:r>
+      <w:r>
+        <w:t xml:space="preserve"> </w:t>
+      </w:r>
+      <w:r>
+        <w:rPr>
+          <w:highlight w:val="yellow"/>
+        </w:rPr>
+        <w:t>(ONLY REQUIRED THE FIRST TIME)</w:t>
+      </w:r>
+    </w:p>
+    <w:p>
+      <w:pPr>
+        <w:pStyle w:val="ListParagraph"/>
+        <w:numPr>
+          <w:ilvl w:val="2"/>
+          <w:numId w:val="2"/>
+        </w:numPr>
+      </w:pPr>
+      <w:r>
+        <w:t xml:space="preserve">In the new tab that </w:t>
+      </w:r>
+      <w:proofErr w:type="gramStart"/>
+      <w:r>
+        <w:t>opens up</w:t>
+      </w:r>
+      <w:proofErr w:type="gramEnd"/>
+      <w:r>
+        <w:t xml:space="preserve"> click the Authorize button</w:t>
+      </w:r>
+      <w:r>
+        <w:t xml:space="preserve"> </w:t>
+      </w:r>
+      <w:r>
+        <w:rPr>
+          <w:highlight w:val="yellow"/>
+        </w:rPr>
+        <w:t>(ONLY REQUIRED THE FIRST TIME)</w:t>
+      </w:r>
+    </w:p>
+    <w:p>
+      <w:pPr>
+        <w:pStyle w:val="ListParagraph"/>
+        <w:numPr>
+          <w:ilvl w:val="2"/>
+          <w:numId w:val="2"/>
+        </w:numPr>
+      </w:pPr>
+      <w:r>
+        <w:rPr>
+          <w:highlight w:val="yellow"/>
+        </w:rPr>
+        <w:t>[SKIP]</w:t>
+      </w:r>
+      <w:r>
+        <w:t xml:space="preserve"> Select </w:t>
+      </w:r>
+      <w:proofErr w:type="spellStart"/>
+      <w:r>
+        <w:t>JmmonJeremy</w:t>
+      </w:r>
+      <w:proofErr w:type="spellEnd"/>
+      <w:r>
+        <w:t>/</w:t>
+      </w:r>
+      <w:proofErr w:type="spellStart"/>
+      <w:r>
+        <w:t>CareerBound</w:t>
+      </w:r>
+      <w:proofErr w:type="spellEnd"/>
+      <w:r>
+        <w:t xml:space="preserve">-SDD and then the folders until you reach the appropriate PNG folder and </w:t>
+      </w:r>
+      <w:r>
+        <w:t>then</w:t>
+      </w:r>
+      <w:r>
+        <w:t xml:space="preserve"> click the Authorize button. In the window that pops up click the Authorize button. Then in the new tab that </w:t>
+      </w:r>
+      <w:proofErr w:type="gramStart"/>
+      <w:r>
+        <w:t>opens up</w:t>
+      </w:r>
+      <w:proofErr w:type="gramEnd"/>
+      <w:r>
+        <w:t xml:space="preserve"> click on the Install button, then change to the selection to Only select repositories &amp; select the </w:t>
+      </w:r>
+      <w:proofErr w:type="spellStart"/>
+      <w:r>
+        <w:t>JmmonJeremy</w:t>
+      </w:r>
+      <w:proofErr w:type="spellEnd"/>
+      <w:r>
+        <w:t>/</w:t>
+      </w:r>
+      <w:proofErr w:type="spellStart"/>
+      <w:r>
+        <w:t>CareerBound</w:t>
+      </w:r>
+      <w:proofErr w:type="spellEnd"/>
+      <w:r>
+        <w:t xml:space="preserve">-SDD repository. Finally, click on the Install button and then enter the password, select the Verify button and close the window. </w:t>
+      </w:r>
+      <w:r>
+        <w:rPr>
+          <w:highlight w:val="yellow"/>
+        </w:rPr>
+        <w:t>(THIS WAS ALREADY DONE BY ME FOR THE REPOSITORY)</w:t>
+      </w:r>
+    </w:p>
+    <w:p>
+      <w:pPr>
+        <w:pStyle w:val="ListParagraph"/>
+        <w:numPr>
+          <w:ilvl w:val="2"/>
+          <w:numId w:val="2"/>
+        </w:numPr>
+      </w:pPr>
+      <w:r>
+        <w:t xml:space="preserve">Select </w:t>
+      </w:r>
+      <w:proofErr w:type="spellStart"/>
+      <w:r>
+        <w:t>JmmonJeremy</w:t>
+      </w:r>
+      <w:proofErr w:type="spellEnd"/>
+      <w:r>
+        <w:t>/</w:t>
+      </w:r>
+      <w:proofErr w:type="spellStart"/>
+      <w:r>
+        <w:t>CareerBound</w:t>
+      </w:r>
+      <w:proofErr w:type="spellEnd"/>
+      <w:r>
+        <w:t xml:space="preserve">-SDD and then the folders until you reach the </w:t>
+      </w:r>
+      <w:r>
+        <w:t xml:space="preserve">appropriate </w:t>
+      </w:r>
+      <w:r>
+        <w:t>PNG</w:t>
+      </w:r>
+      <w:r>
+        <w:t xml:space="preserve"> folder and </w:t>
+      </w:r>
+      <w:r>
+        <w:t>then</w:t>
+      </w:r>
+      <w:r>
+        <w:t xml:space="preserve"> click the OK button </w:t>
+      </w:r>
+      <w:r>
+        <w:rPr>
+          <w:highlight w:val="yellow"/>
+        </w:rPr>
+        <w:t>(THIS FOLDER WILL PERMANENTLY BE ADDED AS AN OPTION IN THE DROPDOWN LIST AFTER THE FIRST TIME)</w:t>
+      </w:r>
+    </w:p>
+    <w:p>
+      <w:pPr>
+        <w:pStyle w:val="ListParagraph"/>
+        <w:numPr>
+          <w:ilvl w:val="2"/>
+          <w:numId w:val="2"/>
+        </w:numPr>
+      </w:pPr>
+      <w:r>
+        <w:t>In the window that pops up</w:t>
+      </w:r>
+      <w:r>
+        <w:t xml:space="preserve"> </w:t>
+      </w:r>
+      <w:r>
+        <w:t>click the Save button</w:t>
+      </w:r>
+      <w:r>
+        <w:t>.</w:t>
+      </w:r>
+    </w:p>
+    <w:p>
+      <w:pPr>
+        <w:pStyle w:val="ListParagraph"/>
+        <w:numPr>
+          <w:ilvl w:val="2"/>
+          <w:numId w:val="2"/>
+        </w:numPr>
+      </w:pPr>
+      <w:r>
+        <w:t>In the window that pops up add your commit message and click the OK button</w:t>
+      </w:r>
+    </w:p>
+    <w:p>
+      <w:pPr>
+        <w:pStyle w:val="ListParagraph"/>
+        <w:numPr>
+          <w:ilvl w:val="0"/>
+          <w:numId w:val="7"/>
+        </w:numPr>
+      </w:pPr>
+      <w:r>
+        <w:t xml:space="preserve">The PNG will be </w:t>
+      </w:r>
+      <w:r>
+        <w:t>past</w:t>
+      </w:r>
+      <w:r>
+        <w:t xml:space="preserve">ed into the final document. </w:t>
+      </w:r>
+    </w:p>
+    <w:p>
+      <w:pPr>
+        <w:pStyle w:val="Sub-Info"/>
+        <w:rPr>
+          <w:rFonts w:eastAsia="Times New Roman"/>
+        </w:rPr>
+      </w:pPr>
+      <w:r>
+        <w:rPr>
+          <w:rFonts w:eastAsia="Times New Roman"/>
+        </w:rPr>
+        <w:t>SharePoint</w:t>
+      </w:r>
+    </w:p>
+    <w:p>
+      <w:pPr>
+        <w:pStyle w:val="ListParagraph"/>
+        <w:numPr>
+          <w:ilvl w:val="0"/>
+          <w:numId w:val="10"/>
+        </w:numPr>
+      </w:pPr>
+      <w:r>
+        <w:t>The OneDrive with our BYUI SharePoint account will be used to store Word documents you are working on.</w:t>
+      </w:r>
+    </w:p>
+    <w:p>
+      <w:pPr>
+        <w:pStyle w:val="ListParagraph"/>
+        <w:numPr>
+          <w:ilvl w:val="0"/>
+          <w:numId w:val="10"/>
+        </w:numPr>
+      </w:pPr>
+      <w:r>
+        <w:t xml:space="preserve">To create a folder to store documents for our </w:t>
+      </w:r>
+      <w:proofErr w:type="spellStart"/>
+      <w:r>
+        <w:t>CareerBound</w:t>
+      </w:r>
+      <w:proofErr w:type="spellEnd"/>
+      <w:r>
+        <w:t xml:space="preserve"> SDD project in this class</w:t>
       </w:r>
       <w:r>
         <w:t>:</w:t>
@@ -1312,61 +1742,492 @@
         </w:numPr>
       </w:pPr>
       <w:r>
-        <w:t>Clicking File f</w:t>
-      </w:r>
-      <w:r>
-        <w:t>ro</w:t>
-      </w:r>
-      <w:r>
-        <w:t>m the top menu</w:t>
-      </w:r>
-      <w:r>
-        <w:t xml:space="preserve"> and s</w:t>
-      </w:r>
-      <w:r>
-        <w:t>electing Export from the dropdown menu</w:t>
-      </w:r>
-    </w:p>
-    <w:p>
-      <w:pPr>
-        <w:pStyle w:val="ListParagraph"/>
-        <w:numPr>
-          <w:ilvl w:val="0"/>
-          <w:numId w:val="2"/>
-        </w:numPr>
-      </w:pPr>
-      <w:r>
-        <w:t>Selecting PNG as they type</w:t>
-      </w:r>
-    </w:p>
-    <w:p>
-      <w:pPr>
-        <w:pStyle w:val="ListParagraph"/>
-        <w:numPr>
-          <w:ilvl w:val="0"/>
-          <w:numId w:val="2"/>
-        </w:numPr>
-      </w:pPr>
-      <w:r>
-        <w:t>Clicking on the Export button in the window that pops up</w:t>
-      </w:r>
-    </w:p>
-    <w:p>
-      <w:pPr>
-        <w:pStyle w:val="ListParagraph"/>
-        <w:numPr>
-          <w:ilvl w:val="0"/>
-          <w:numId w:val="2"/>
-        </w:numPr>
-      </w:pPr>
-      <w:r>
-        <w:t xml:space="preserve">In the next window that pops up under the Where section select one of 2 </w:t>
+        <w:t>C</w:t>
+      </w:r>
+      <w:r>
+        <w:t xml:space="preserve">lick on the blue button with rounded corners that says + Create or upload </w:t>
+      </w:r>
+      <w:r>
+        <w:t xml:space="preserve">located </w:t>
+      </w:r>
+      <w:r>
+        <w:t>in the top right-hand corner</w:t>
+      </w:r>
+      <w:r>
+        <w:t>.</w:t>
+      </w:r>
+    </w:p>
+    <w:p>
+      <w:pPr>
+        <w:pStyle w:val="ListParagraph"/>
+        <w:numPr>
+          <w:ilvl w:val="0"/>
+          <w:numId w:val="2"/>
+        </w:numPr>
+      </w:pPr>
+      <w:r>
+        <w:t>Select the Folder option at the top of the dropdown menu</w:t>
+      </w:r>
+      <w:r>
+        <w:t>.</w:t>
+      </w:r>
+    </w:p>
+    <w:p>
+      <w:pPr>
+        <w:pStyle w:val="ListParagraph"/>
+        <w:numPr>
+          <w:ilvl w:val="0"/>
+          <w:numId w:val="2"/>
+        </w:numPr>
+      </w:pPr>
+      <w:r>
+        <w:t>Name and color your folder as desired and click the Create button</w:t>
+      </w:r>
+      <w:r>
+        <w:t>.</w:t>
+      </w:r>
+    </w:p>
+    <w:p>
+      <w:pPr>
+        <w:pStyle w:val="ListParagraph"/>
+        <w:numPr>
+          <w:ilvl w:val="0"/>
+          <w:numId w:val="10"/>
+        </w:numPr>
+      </w:pPr>
+      <w:r>
+        <w:t xml:space="preserve">To access the folder for our </w:t>
       </w:r>
       <w:proofErr w:type="spellStart"/>
       <w:r>
-        <w:t>optioins</w:t>
+        <w:t>CareerBound</w:t>
       </w:r>
       <w:proofErr w:type="spellEnd"/>
+      <w:r>
+        <w:t xml:space="preserve"> SDD project in this class:</w:t>
+      </w:r>
+    </w:p>
+    <w:p>
+      <w:pPr>
+        <w:pStyle w:val="ListParagraph"/>
+        <w:numPr>
+          <w:ilvl w:val="0"/>
+          <w:numId w:val="2"/>
+        </w:numPr>
+      </w:pPr>
+      <w:r>
+        <w:t>Click on the My files link located on the right-hand side of the page</w:t>
+      </w:r>
+      <w:r>
+        <w:t>.</w:t>
+      </w:r>
+    </w:p>
+    <w:p>
+      <w:pPr>
+        <w:pStyle w:val="ListParagraph"/>
+        <w:numPr>
+          <w:ilvl w:val="0"/>
+          <w:numId w:val="2"/>
+        </w:numPr>
+      </w:pPr>
+      <w:r>
+        <w:t>Click on the folder you created</w:t>
+      </w:r>
+      <w:r>
+        <w:t>.</w:t>
+      </w:r>
+    </w:p>
+    <w:p>
+      <w:pPr>
+        <w:pStyle w:val="ListParagraph"/>
+        <w:numPr>
+          <w:ilvl w:val="0"/>
+          <w:numId w:val="10"/>
+        </w:numPr>
+      </w:pPr>
+      <w:r>
+        <w:t>To add a document from your local computer:</w:t>
+      </w:r>
+    </w:p>
+    <w:p>
+      <w:pPr>
+        <w:pStyle w:val="ListParagraph"/>
+        <w:numPr>
+          <w:ilvl w:val="0"/>
+          <w:numId w:val="2"/>
+        </w:numPr>
+      </w:pPr>
+      <w:r>
+        <w:t>Go into the folder you want the file uploaded to in your OneDrive in SharePo</w:t>
+      </w:r>
+      <w:r>
+        <w:t>i</w:t>
+      </w:r>
+      <w:r>
+        <w:t>nt</w:t>
+      </w:r>
+      <w:r>
+        <w:t>.</w:t>
+      </w:r>
+    </w:p>
+    <w:p>
+      <w:pPr>
+        <w:pStyle w:val="ListParagraph"/>
+        <w:numPr>
+          <w:ilvl w:val="0"/>
+          <w:numId w:val="2"/>
+        </w:numPr>
+      </w:pPr>
+      <w:r>
+        <w:t>Click on the blue button with rounded corners that says + Create or upload located in the top right-hand corner.</w:t>
+      </w:r>
+    </w:p>
+    <w:p>
+      <w:pPr>
+        <w:pStyle w:val="ListParagraph"/>
+        <w:numPr>
+          <w:ilvl w:val="0"/>
+          <w:numId w:val="2"/>
+        </w:numPr>
+      </w:pPr>
+      <w:r>
+        <w:t>Select the Files upload option at the top of the dropdown menu</w:t>
+      </w:r>
+      <w:r>
+        <w:t>.</w:t>
+      </w:r>
+    </w:p>
+    <w:p>
+      <w:pPr>
+        <w:pStyle w:val="ListParagraph"/>
+        <w:numPr>
+          <w:ilvl w:val="0"/>
+          <w:numId w:val="2"/>
+        </w:numPr>
+      </w:pPr>
+      <w:r>
+        <w:lastRenderedPageBreak/>
+        <w:t>Select the Word document from the pop-up window and click on the Open button</w:t>
+      </w:r>
+      <w:r>
+        <w:t>.</w:t>
+      </w:r>
+    </w:p>
+    <w:p>
+      <w:pPr>
+        <w:pStyle w:val="ListParagraph"/>
+        <w:numPr>
+          <w:ilvl w:val="0"/>
+          <w:numId w:val="10"/>
+        </w:numPr>
+      </w:pPr>
+      <w:r>
+        <w:t>To download a document from</w:t>
+      </w:r>
+      <w:r>
+        <w:t xml:space="preserve"> </w:t>
+      </w:r>
+      <w:r>
+        <w:t>your OneDrive folder in SharePoint:</w:t>
+      </w:r>
+    </w:p>
+    <w:p>
+      <w:pPr>
+        <w:pStyle w:val="ListParagraph"/>
+        <w:numPr>
+          <w:ilvl w:val="0"/>
+          <w:numId w:val="2"/>
+        </w:numPr>
+      </w:pPr>
+      <w:r>
+        <w:t>Go to your folder in your OneDrive in SharePoint.</w:t>
+      </w:r>
+    </w:p>
+    <w:p>
+      <w:pPr>
+        <w:pStyle w:val="ListParagraph"/>
+        <w:numPr>
+          <w:ilvl w:val="0"/>
+          <w:numId w:val="2"/>
+        </w:numPr>
+      </w:pPr>
+      <w:r>
+        <w:t>Select the Download option from the top ribbon menu.</w:t>
+      </w:r>
+    </w:p>
+    <w:p>
+      <w:pPr>
+        <w:pStyle w:val="ListParagraph"/>
+        <w:numPr>
+          <w:ilvl w:val="0"/>
+          <w:numId w:val="2"/>
+        </w:numPr>
+      </w:pPr>
+      <w:r>
+        <w:t>Move the file from your local Downloads folder to your desired location for the file.</w:t>
+      </w:r>
+    </w:p>
+    <w:p>
+      <w:pPr>
+        <w:pStyle w:val="ListParagraph"/>
+        <w:numPr>
+          <w:ilvl w:val="0"/>
+          <w:numId w:val="10"/>
+        </w:numPr>
+      </w:pPr>
+      <w:r>
+        <w:t>To start a new Word document in SharePoint:</w:t>
+      </w:r>
+    </w:p>
+    <w:p>
+      <w:pPr>
+        <w:pStyle w:val="ListParagraph"/>
+        <w:numPr>
+          <w:ilvl w:val="0"/>
+          <w:numId w:val="2"/>
+        </w:numPr>
+      </w:pPr>
+      <w:r>
+        <w:t xml:space="preserve">Go into the folder you want the documents to </w:t>
+      </w:r>
+      <w:proofErr w:type="gramStart"/>
+      <w:r>
+        <w:t>be located in</w:t>
+      </w:r>
+      <w:proofErr w:type="gramEnd"/>
+      <w:r>
+        <w:t xml:space="preserve"> SharePoint.</w:t>
+      </w:r>
+    </w:p>
+    <w:p>
+      <w:pPr>
+        <w:pStyle w:val="ListParagraph"/>
+        <w:numPr>
+          <w:ilvl w:val="0"/>
+          <w:numId w:val="2"/>
+        </w:numPr>
+      </w:pPr>
+      <w:r>
+        <w:t>Click on the blue button with rounded corners that says + Create or upload located in the top right-hand corner.</w:t>
+      </w:r>
+    </w:p>
+    <w:p>
+      <w:pPr>
+        <w:pStyle w:val="ListParagraph"/>
+        <w:numPr>
+          <w:ilvl w:val="0"/>
+          <w:numId w:val="2"/>
+        </w:numPr>
+      </w:pPr>
+      <w:r>
+        <w:t xml:space="preserve">Select the Word </w:t>
+      </w:r>
+      <w:r>
+        <w:t>document</w:t>
+      </w:r>
+      <w:r>
+        <w:t xml:space="preserve"> option from the dropdown menu.</w:t>
+      </w:r>
+    </w:p>
+    <w:p>
+      <w:pPr>
+        <w:pStyle w:val="ListParagraph"/>
+        <w:numPr>
+          <w:ilvl w:val="0"/>
+          <w:numId w:val="2"/>
+        </w:numPr>
+      </w:pPr>
+      <w:r>
+        <w:t xml:space="preserve">In the new tab that </w:t>
+      </w:r>
+      <w:proofErr w:type="gramStart"/>
+      <w:r>
+        <w:t>opens up</w:t>
+      </w:r>
+      <w:proofErr w:type="gramEnd"/>
+      <w:r>
+        <w:t xml:space="preserve"> </w:t>
+      </w:r>
+      <w:r>
+        <w:t xml:space="preserve">with a Word document </w:t>
+      </w:r>
+      <w:r>
+        <w:t>name the document by clicking</w:t>
+      </w:r>
+      <w:r>
+        <w:t xml:space="preserve"> on the word Document located in the top right corner and </w:t>
+      </w:r>
+      <w:proofErr w:type="gramStart"/>
+      <w:r>
+        <w:t>replace</w:t>
+      </w:r>
+      <w:proofErr w:type="gramEnd"/>
+      <w:r>
+        <w:t xml:space="preserve"> Document with the desired name for the file.</w:t>
+      </w:r>
+    </w:p>
+    <w:p>
+      <w:pPr>
+        <w:pStyle w:val="ListParagraph"/>
+        <w:numPr>
+          <w:ilvl w:val="0"/>
+          <w:numId w:val="2"/>
+        </w:numPr>
+      </w:pPr>
+      <w:r>
+        <w:t xml:space="preserve">It is automatically saved in the </w:t>
+      </w:r>
+      <w:r>
+        <w:t>folder,</w:t>
+      </w:r>
+      <w:r>
+        <w:t xml:space="preserve"> and you will see it after you refresh the browser while in the folder.</w:t>
+      </w:r>
+    </w:p>
+    <w:p>
+      <w:pPr>
+        <w:pStyle w:val="ListParagraph"/>
+        <w:numPr>
+          <w:ilvl w:val="0"/>
+          <w:numId w:val="2"/>
+        </w:numPr>
+      </w:pPr>
+      <w:r>
+        <w:t>Changes made to the document will now automatically be saved in your folder.</w:t>
+      </w:r>
+    </w:p>
+    <w:p>
+      <w:pPr>
+        <w:pStyle w:val="ListParagraph"/>
+        <w:numPr>
+          <w:ilvl w:val="0"/>
+          <w:numId w:val="10"/>
+        </w:numPr>
+      </w:pPr>
+      <w:r>
+        <w:t xml:space="preserve">To see the </w:t>
+      </w:r>
+      <w:r>
+        <w:t>history version</w:t>
+      </w:r>
+      <w:r>
+        <w:t xml:space="preserve"> of your Word document in </w:t>
+      </w:r>
+      <w:r>
+        <w:t>SharePoint</w:t>
+      </w:r>
+    </w:p>
+    <w:p>
+      <w:pPr>
+        <w:pStyle w:val="ListParagraph"/>
+        <w:numPr>
+          <w:ilvl w:val="0"/>
+          <w:numId w:val="2"/>
+        </w:numPr>
+      </w:pPr>
+      <w:r>
+        <w:t>Go to your folder location and click on the document to open it.</w:t>
+      </w:r>
+    </w:p>
+    <w:p>
+      <w:pPr>
+        <w:pStyle w:val="ListParagraph"/>
+        <w:numPr>
+          <w:ilvl w:val="0"/>
+          <w:numId w:val="2"/>
+        </w:numPr>
+      </w:pPr>
+      <w:r>
+        <w:t>In the new window with the open document c</w:t>
+      </w:r>
+      <w:r>
+        <w:t xml:space="preserve">lick on the </w:t>
+      </w:r>
+      <w:proofErr w:type="gramStart"/>
+      <w:r>
+        <w:t>Catch up</w:t>
+      </w:r>
+      <w:proofErr w:type="gramEnd"/>
+      <w:r>
+        <w:t xml:space="preserve"> b</w:t>
+      </w:r>
+      <w:r>
+        <w:t>u</w:t>
+      </w:r>
+      <w:r>
+        <w:t>tton located on the top left-hand side</w:t>
+      </w:r>
+      <w:r>
+        <w:t xml:space="preserve"> of the window.</w:t>
+      </w:r>
+    </w:p>
+    <w:p>
+      <w:pPr>
+        <w:pStyle w:val="ListParagraph"/>
+        <w:numPr>
+          <w:ilvl w:val="0"/>
+          <w:numId w:val="2"/>
+        </w:numPr>
+      </w:pPr>
+      <w:r>
+        <w:t>Click on the Version History link that is listed in the pop-up window.</w:t>
+      </w:r>
+    </w:p>
+    <w:p>
+      <w:pPr>
+        <w:pStyle w:val="ListParagraph"/>
+        <w:numPr>
+          <w:ilvl w:val="0"/>
+          <w:numId w:val="2"/>
+        </w:numPr>
+      </w:pPr>
+      <w:r>
+        <w:t>Click on the point you version time stamp you want to see.</w:t>
+      </w:r>
+    </w:p>
+    <w:p>
+      <w:pPr>
+        <w:pStyle w:val="ListParagraph"/>
+        <w:numPr>
+          <w:ilvl w:val="0"/>
+          <w:numId w:val="2"/>
+        </w:numPr>
+      </w:pPr>
+      <w:r>
+        <w:t xml:space="preserve">You can also select at the top of the Version History to Show Edits by turning on the Show </w:t>
+      </w:r>
+      <w:proofErr w:type="gramStart"/>
+      <w:r>
+        <w:t>edits</w:t>
+      </w:r>
+      <w:proofErr w:type="gramEnd"/>
+      <w:r>
+        <w:t xml:space="preserve"> button</w:t>
+      </w:r>
+    </w:p>
+    <w:p>
+      <w:pPr>
+        <w:pStyle w:val="ListParagraph"/>
+        <w:numPr>
+          <w:ilvl w:val="0"/>
+          <w:numId w:val="10"/>
+        </w:numPr>
+      </w:pPr>
+      <w:r>
+        <w:t>To work on the same Word document at the same time and see edits as you work:</w:t>
+      </w:r>
+    </w:p>
+    <w:p>
+      <w:pPr>
+        <w:pStyle w:val="ListParagraph"/>
+        <w:numPr>
+          <w:ilvl w:val="0"/>
+          <w:numId w:val="2"/>
+        </w:numPr>
+      </w:pPr>
+      <w:r>
+        <w:t>Option 1 - from the Word document:</w:t>
+      </w:r>
     </w:p>
     <w:p>
       <w:pPr>
@@ -1377,46 +2238,7 @@
         </w:numPr>
       </w:pPr>
       <w:r>
-        <w:t xml:space="preserve">Option 1 select </w:t>
-      </w:r>
-      <w:r>
-        <w:t>Download</w:t>
-      </w:r>
-      <w:r>
-        <w:t xml:space="preserve"> </w:t>
-      </w:r>
-      <w:r>
-        <w:t>and click the OK button</w:t>
-      </w:r>
-    </w:p>
-    <w:p>
-      <w:pPr>
-        <w:pStyle w:val="ListParagraph"/>
-        <w:numPr>
-          <w:ilvl w:val="2"/>
-          <w:numId w:val="2"/>
-        </w:numPr>
-      </w:pPr>
-      <w:r>
-        <w:t xml:space="preserve">On your local system move the downloaded file from </w:t>
-      </w:r>
-      <w:r>
-        <w:t>your</w:t>
-      </w:r>
-      <w:r>
-        <w:t xml:space="preserve"> Downloads folder to the appropriate folder in the project</w:t>
-      </w:r>
-    </w:p>
-    <w:p>
-      <w:pPr>
-        <w:pStyle w:val="ListParagraph"/>
-        <w:numPr>
-          <w:ilvl w:val="2"/>
-          <w:numId w:val="2"/>
-        </w:numPr>
-      </w:pPr>
-      <w:r>
-        <w:t>Commit the changes to the repository</w:t>
+        <w:t>While in the Word document window select the Share dropdown menu located on the top left-hand side of the window.</w:t>
       </w:r>
     </w:p>
     <w:p>
@@ -1428,1023 +2250,244 @@
         </w:numPr>
       </w:pPr>
       <w:r>
-        <w:t xml:space="preserve">Option </w:t>
-      </w:r>
-      <w:r>
-        <w:t>2</w:t>
-      </w:r>
-      <w:r>
-        <w:t xml:space="preserve"> select GitHub - Pick a folder ...</w:t>
-      </w:r>
-    </w:p>
-    <w:p>
-      <w:pPr>
-        <w:pStyle w:val="ListParagraph"/>
-        <w:numPr>
-          <w:ilvl w:val="2"/>
-          <w:numId w:val="2"/>
-        </w:numPr>
-      </w:pPr>
-      <w:r>
-        <w:t>In the window that pops up click on Authorize button with Remember me selected</w:t>
-      </w:r>
-      <w:r>
-        <w:t xml:space="preserve"> </w:t>
-      </w:r>
-      <w:r>
-        <w:rPr>
-          <w:highlight w:val="yellow"/>
-        </w:rPr>
-        <w:t>(ONLY REQUIRED THE FIRST TIME)</w:t>
-      </w:r>
-    </w:p>
-    <w:p>
-      <w:pPr>
-        <w:pStyle w:val="ListParagraph"/>
-        <w:numPr>
-          <w:ilvl w:val="2"/>
-          <w:numId w:val="2"/>
-        </w:numPr>
-      </w:pPr>
-      <w:r>
-        <w:t xml:space="preserve">In the new tab that </w:t>
+        <w:t xml:space="preserve">Click the Share option from the </w:t>
+      </w:r>
+      <w:r>
+        <w:t>dropdown</w:t>
+      </w:r>
+      <w:r>
+        <w:t xml:space="preserve"> list.</w:t>
+      </w:r>
+    </w:p>
+    <w:p>
+      <w:pPr>
+        <w:pStyle w:val="ListParagraph"/>
+        <w:numPr>
+          <w:ilvl w:val="1"/>
+          <w:numId w:val="2"/>
+        </w:numPr>
+      </w:pPr>
+      <w:r>
+        <w:t>Then proceed with the steps below.</w:t>
+      </w:r>
+    </w:p>
+    <w:p>
+      <w:pPr>
+        <w:pStyle w:val="ListParagraph"/>
+        <w:numPr>
+          <w:ilvl w:val="0"/>
+          <w:numId w:val="2"/>
+        </w:numPr>
+      </w:pPr>
+      <w:r>
+        <w:t>Option 2 - from the Folder containing the Word document:</w:t>
+      </w:r>
+    </w:p>
+    <w:p>
+      <w:pPr>
+        <w:pStyle w:val="ListParagraph"/>
+        <w:numPr>
+          <w:ilvl w:val="1"/>
+          <w:numId w:val="2"/>
+        </w:numPr>
+      </w:pPr>
+      <w:r>
+        <w:t>Select the document or documents you want to collaborate on by checking the white dot that appears next to the document on the left when you hover over the document.</w:t>
+      </w:r>
+    </w:p>
+    <w:p>
+      <w:pPr>
+        <w:pStyle w:val="ListParagraph"/>
+        <w:numPr>
+          <w:ilvl w:val="1"/>
+          <w:numId w:val="2"/>
+        </w:numPr>
+      </w:pPr>
+      <w:r>
+        <w:t>Then click on the share button located on the top tool ribbon.</w:t>
+      </w:r>
+    </w:p>
+    <w:p>
+      <w:pPr>
+        <w:pStyle w:val="ListParagraph"/>
+        <w:numPr>
+          <w:ilvl w:val="1"/>
+          <w:numId w:val="2"/>
+        </w:numPr>
+      </w:pPr>
+      <w:r>
+        <w:t>Then proceed with the steps below.</w:t>
+      </w:r>
+    </w:p>
+    <w:p>
+      <w:pPr>
+        <w:pStyle w:val="ListParagraph"/>
+        <w:numPr>
+          <w:ilvl w:val="0"/>
+          <w:numId w:val="2"/>
+        </w:numPr>
+      </w:pPr>
+      <w:r>
+        <w:t xml:space="preserve">In the </w:t>
+      </w:r>
+      <w:r>
+        <w:t>pop-up</w:t>
+      </w:r>
+      <w:r>
+        <w:t xml:space="preserve"> window enter the BYUI email address of the person you want to collaborate with.</w:t>
+      </w:r>
+    </w:p>
+    <w:p>
+      <w:pPr>
+        <w:pStyle w:val="ListParagraph"/>
+        <w:numPr>
+          <w:ilvl w:val="0"/>
+          <w:numId w:val="2"/>
+        </w:numPr>
+      </w:pPr>
+      <w:r>
+        <w:t xml:space="preserve">Click on the Settings symbol next to the Copy link in the same popup window and make sure that under </w:t>
+      </w:r>
+      <w:r>
+        <w:t>the</w:t>
+      </w:r>
+      <w:r>
+        <w:t xml:space="preserve"> link works for heading People you choose is selected and under the More settings heading Can edit is selected.</w:t>
+      </w:r>
+      <w:r>
+        <w:t xml:space="preserve"> If you </w:t>
       </w:r>
       <w:proofErr w:type="gramStart"/>
       <w:r>
-        <w:t>opens up</w:t>
+        <w:t>have to</w:t>
       </w:r>
       <w:proofErr w:type="gramEnd"/>
       <w:r>
-        <w:t xml:space="preserve"> click the Authorize button</w:t>
-      </w:r>
-      <w:r>
-        <w:t xml:space="preserve"> </w:t>
-      </w:r>
-      <w:r>
-        <w:rPr>
-          <w:highlight w:val="yellow"/>
-        </w:rPr>
-        <w:t>(ONLY REQUIRED THE FIRST TIME)</w:t>
-      </w:r>
-    </w:p>
-    <w:p>
-      <w:pPr>
-        <w:pStyle w:val="ListParagraph"/>
-        <w:numPr>
-          <w:ilvl w:val="2"/>
-          <w:numId w:val="2"/>
-        </w:numPr>
-      </w:pPr>
-      <w:r>
-        <w:rPr>
-          <w:highlight w:val="yellow"/>
-        </w:rPr>
-        <w:t>[SKIP]</w:t>
-      </w:r>
-      <w:r>
-        <w:t xml:space="preserve"> Select </w:t>
+        <w:t xml:space="preserve"> change the </w:t>
+      </w:r>
+      <w:r>
+        <w:t>settings,</w:t>
+      </w:r>
+      <w:r>
+        <w:t xml:space="preserve"> click the Apply button, otherwise if the </w:t>
+      </w:r>
+      <w:r>
+        <w:t>settings</w:t>
+      </w:r>
+      <w:r>
+        <w:t xml:space="preserve"> are </w:t>
+      </w:r>
+      <w:r>
+        <w:t>correct,</w:t>
+      </w:r>
+      <w:r>
+        <w:t xml:space="preserve"> you can X out of the settings.</w:t>
+      </w:r>
+    </w:p>
+    <w:p>
+      <w:pPr>
+        <w:pStyle w:val="ListParagraph"/>
+        <w:numPr>
+          <w:ilvl w:val="0"/>
+          <w:numId w:val="2"/>
+        </w:numPr>
+      </w:pPr>
+      <w:r>
+        <w:t>Copy the link to the document and paste it into the Add a message window.</w:t>
+      </w:r>
+    </w:p>
+    <w:p>
+      <w:pPr>
+        <w:pStyle w:val="ListParagraph"/>
+        <w:numPr>
+          <w:ilvl w:val="0"/>
+          <w:numId w:val="2"/>
+        </w:numPr>
+      </w:pPr>
+      <w:r>
+        <w:lastRenderedPageBreak/>
+        <w:t>Hover over the pencil icon next to the email you entered and make sure it says Can edit (If it doesn't click on the dropdown arrow and select Can edit)</w:t>
+      </w:r>
+    </w:p>
+    <w:p>
+      <w:pPr>
+        <w:pStyle w:val="ListParagraph"/>
+        <w:numPr>
+          <w:ilvl w:val="0"/>
+          <w:numId w:val="2"/>
+        </w:numPr>
+      </w:pPr>
+      <w:r>
+        <w:t>Click on the Send button</w:t>
+      </w:r>
+    </w:p>
+    <w:p>
+      <w:pPr>
+        <w:pStyle w:val="ListParagraph"/>
+        <w:numPr>
+          <w:ilvl w:val="0"/>
+          <w:numId w:val="2"/>
+        </w:numPr>
+      </w:pPr>
+      <w:r>
+        <w:t>Now you can both open the document and work on it together and you will see each other's names at the top, colored cursors, and edits will appear in real time.</w:t>
+      </w:r>
+    </w:p>
+    <w:p>
+      <w:pPr>
+        <w:pStyle w:val="Sub-Info"/>
+        <w:rPr>
+          <w:rFonts w:eastAsia="Times New Roman"/>
+        </w:rPr>
+      </w:pPr>
+      <w:r>
+        <w:rPr>
+          <w:rFonts w:eastAsia="Times New Roman"/>
+        </w:rPr>
+        <w:t>Trello</w:t>
+      </w:r>
+      <w:r>
+        <w:rPr>
+          <w:rFonts w:eastAsia="Times New Roman"/>
+        </w:rPr>
+        <w:t xml:space="preserve"> like Teams Planner Board</w:t>
+      </w:r>
+    </w:p>
+    <w:p>
+      <w:pPr>
+        <w:pStyle w:val="ListParagraph"/>
+        <w:numPr>
+          <w:ilvl w:val="0"/>
+          <w:numId w:val="12"/>
+        </w:numPr>
+      </w:pPr>
+      <w:r>
+        <w:t>There is a tab labeled "</w:t>
       </w:r>
       <w:proofErr w:type="spellStart"/>
       <w:r>
-        <w:t>JmmonJeremy</w:t>
+        <w:t>CareerBound</w:t>
       </w:r>
       <w:proofErr w:type="spellEnd"/>
       <w:r>
-        <w:t>/</w:t>
-      </w:r>
-      <w:proofErr w:type="spellStart"/>
-      <w:r>
-        <w:t>CareerBound</w:t>
-      </w:r>
-      <w:proofErr w:type="spellEnd"/>
-      <w:r>
-        <w:t xml:space="preserve">-SDD and then the folders until you reach the appropriate PNG folder and </w:t>
-      </w:r>
-      <w:r>
-        <w:t>then</w:t>
-      </w:r>
-      <w:r>
-        <w:t xml:space="preserve"> click the Authorize button. In the window that pops up click the Authorize button. Then in the new tab that </w:t>
-      </w:r>
-      <w:proofErr w:type="gramStart"/>
-      <w:r>
-        <w:t>opens up</w:t>
-      </w:r>
-      <w:proofErr w:type="gramEnd"/>
-      <w:r>
-        <w:t xml:space="preserve"> click on the Install button, then change to the selection to Only select repositories &amp; select the </w:t>
-      </w:r>
-      <w:proofErr w:type="spellStart"/>
-      <w:r>
-        <w:t>JmmonJeremy</w:t>
-      </w:r>
-      <w:proofErr w:type="spellEnd"/>
-      <w:r>
-        <w:t>/</w:t>
-      </w:r>
-      <w:proofErr w:type="spellStart"/>
-      <w:r>
-        <w:t>CareerBound</w:t>
-      </w:r>
-      <w:proofErr w:type="spellEnd"/>
-      <w:r>
-        <w:t xml:space="preserve">-SDD repository. Finally, click on the Install button and then enter the password, select the Verify button and close the window. </w:t>
-      </w:r>
-      <w:r>
-        <w:rPr>
-          <w:highlight w:val="yellow"/>
-        </w:rPr>
-        <w:t>(THIS WAS ALREADY DONE BY ME FOR THE REPOSITORY)</w:t>
-      </w:r>
-    </w:p>
-    <w:p>
-      <w:pPr>
-        <w:pStyle w:val="ListParagraph"/>
-        <w:numPr>
-          <w:ilvl w:val="2"/>
-          <w:numId w:val="2"/>
-        </w:numPr>
-      </w:pPr>
-      <w:r>
-        <w:t xml:space="preserve">Select </w:t>
-      </w:r>
-      <w:proofErr w:type="spellStart"/>
-      <w:r>
-        <w:t>JmmonJeremy</w:t>
-      </w:r>
-      <w:proofErr w:type="spellEnd"/>
-      <w:r>
-        <w:t>/</w:t>
-      </w:r>
-      <w:proofErr w:type="spellStart"/>
-      <w:r>
-        <w:t>CareerBound</w:t>
-      </w:r>
-      <w:proofErr w:type="spellEnd"/>
-      <w:r>
-        <w:t xml:space="preserve">-SDD and then the folders until you reach the </w:t>
-      </w:r>
-      <w:r>
-        <w:t xml:space="preserve">appropriate </w:t>
-      </w:r>
-      <w:r>
-        <w:t>PNG</w:t>
-      </w:r>
-      <w:r>
-        <w:t xml:space="preserve"> folder and </w:t>
-      </w:r>
-      <w:r>
-        <w:t>then</w:t>
-      </w:r>
-      <w:r>
-        <w:t xml:space="preserve"> click the OK button </w:t>
-      </w:r>
-      <w:r>
-        <w:rPr>
-          <w:highlight w:val="yellow"/>
-        </w:rPr>
-        <w:t>(THIS FOLDER WILL PERMANENTLY BE ADDED AS AN OPTION IN THE DROPDOWN LIST AFTER THE FIRST TIME)</w:t>
-      </w:r>
-    </w:p>
-    <w:p>
-      <w:pPr>
-        <w:pStyle w:val="ListParagraph"/>
-        <w:numPr>
-          <w:ilvl w:val="2"/>
-          <w:numId w:val="2"/>
-        </w:numPr>
-      </w:pPr>
-      <w:r>
-        <w:t>In the window that pops up</w:t>
-      </w:r>
-      <w:r>
-        <w:t xml:space="preserve"> </w:t>
-      </w:r>
-      <w:r>
-        <w:t>click the Save button</w:t>
-      </w:r>
-      <w:r>
-        <w:t>.</w:t>
-      </w:r>
-    </w:p>
-    <w:p>
-      <w:pPr>
-        <w:pStyle w:val="ListParagraph"/>
-        <w:numPr>
-          <w:ilvl w:val="2"/>
-          <w:numId w:val="2"/>
-        </w:numPr>
-      </w:pPr>
-      <w:r>
-        <w:t>In the window that pops up add your commit message and click the OK button</w:t>
-      </w:r>
-    </w:p>
-    <w:p>
-      <w:pPr>
-        <w:pStyle w:val="ListParagraph"/>
-        <w:numPr>
-          <w:ilvl w:val="0"/>
-          <w:numId w:val="7"/>
-        </w:numPr>
-      </w:pPr>
-      <w:r>
-        <w:t xml:space="preserve">The PNG will be </w:t>
-      </w:r>
-      <w:r>
-        <w:t>past</w:t>
-      </w:r>
-      <w:r>
-        <w:t xml:space="preserve">ed into the final document. </w:t>
-      </w:r>
-    </w:p>
-    <w:p>
-      <w:pPr>
-        <w:pStyle w:val="Sub-Info"/>
-        <w:rPr>
-          <w:rFonts w:eastAsia="Times New Roman"/>
-        </w:rPr>
-      </w:pPr>
-      <w:r>
-        <w:rPr>
-          <w:rFonts w:eastAsia="Times New Roman"/>
-        </w:rPr>
-        <w:t>SharePoint</w:t>
-      </w:r>
-    </w:p>
-    <w:p>
-      <w:pPr>
-        <w:pStyle w:val="ListParagraph"/>
-        <w:numPr>
-          <w:ilvl w:val="0"/>
-          <w:numId w:val="10"/>
-        </w:numPr>
-      </w:pPr>
-      <w:r>
-        <w:t>The OneDrive with our BYUI SharePoint account will be used to store Word documents you are working on.</w:t>
-      </w:r>
-    </w:p>
-    <w:p>
-      <w:pPr>
-        <w:pStyle w:val="ListParagraph"/>
-        <w:numPr>
-          <w:ilvl w:val="0"/>
-          <w:numId w:val="10"/>
-        </w:numPr>
-      </w:pPr>
-      <w:r>
-        <w:t xml:space="preserve">To create a folder to store documents for our </w:t>
-      </w:r>
-      <w:proofErr w:type="spellStart"/>
-      <w:r>
-        <w:t>CareerBound</w:t>
-      </w:r>
-      <w:proofErr w:type="spellEnd"/>
-      <w:r>
-        <w:t xml:space="preserve"> SDD project in this class</w:t>
-      </w:r>
-      <w:r>
-        <w:t>:</w:t>
-      </w:r>
-    </w:p>
-    <w:p>
-      <w:pPr>
-        <w:pStyle w:val="ListParagraph"/>
-        <w:numPr>
-          <w:ilvl w:val="0"/>
-          <w:numId w:val="2"/>
-        </w:numPr>
-      </w:pPr>
-      <w:r>
-        <w:t>C</w:t>
-      </w:r>
-      <w:r>
-        <w:t xml:space="preserve">lick on the blue button with rounded corners that says + Create or upload </w:t>
-      </w:r>
-      <w:r>
-        <w:t xml:space="preserve">located </w:t>
-      </w:r>
-      <w:r>
-        <w:t>in the top right-hand corner</w:t>
-      </w:r>
-      <w:r>
-        <w:t>.</w:t>
-      </w:r>
-    </w:p>
-    <w:p>
-      <w:pPr>
-        <w:pStyle w:val="ListParagraph"/>
-        <w:numPr>
-          <w:ilvl w:val="0"/>
-          <w:numId w:val="2"/>
-        </w:numPr>
-      </w:pPr>
-      <w:r>
-        <w:t>Select the Folder option at the top of the dropdown menu</w:t>
-      </w:r>
-      <w:r>
-        <w:t>.</w:t>
-      </w:r>
-    </w:p>
-    <w:p>
-      <w:pPr>
-        <w:pStyle w:val="ListParagraph"/>
-        <w:numPr>
-          <w:ilvl w:val="0"/>
-          <w:numId w:val="2"/>
-        </w:numPr>
-      </w:pPr>
-      <w:r>
-        <w:t>Name and color your folder as desired and click the Create button</w:t>
-      </w:r>
-      <w:r>
-        <w:t>.</w:t>
-      </w:r>
-    </w:p>
-    <w:p>
-      <w:pPr>
-        <w:pStyle w:val="ListParagraph"/>
-        <w:numPr>
-          <w:ilvl w:val="0"/>
-          <w:numId w:val="10"/>
-        </w:numPr>
-      </w:pPr>
-      <w:r>
-        <w:t xml:space="preserve">To access the folder for our </w:t>
-      </w:r>
-      <w:proofErr w:type="spellStart"/>
-      <w:r>
-        <w:t>CareerBound</w:t>
-      </w:r>
-      <w:proofErr w:type="spellEnd"/>
-      <w:r>
-        <w:t xml:space="preserve"> SDD project in this class:</w:t>
-      </w:r>
-    </w:p>
-    <w:p>
-      <w:pPr>
-        <w:pStyle w:val="ListParagraph"/>
-        <w:numPr>
-          <w:ilvl w:val="0"/>
-          <w:numId w:val="2"/>
-        </w:numPr>
-      </w:pPr>
-      <w:r>
-        <w:t>Click on the My files link located on the right-hand side of the page</w:t>
-      </w:r>
-      <w:r>
-        <w:t>.</w:t>
-      </w:r>
-    </w:p>
-    <w:p>
-      <w:pPr>
-        <w:pStyle w:val="ListParagraph"/>
-        <w:numPr>
-          <w:ilvl w:val="0"/>
-          <w:numId w:val="2"/>
-        </w:numPr>
-      </w:pPr>
-      <w:r>
-        <w:t>Click on the folder you created</w:t>
-      </w:r>
-      <w:r>
-        <w:t>.</w:t>
-      </w:r>
-    </w:p>
-    <w:p>
-      <w:pPr>
-        <w:pStyle w:val="ListParagraph"/>
-        <w:numPr>
-          <w:ilvl w:val="0"/>
-          <w:numId w:val="10"/>
-        </w:numPr>
-      </w:pPr>
-      <w:r>
-        <w:t>To add a document from your local computer:</w:t>
-      </w:r>
-    </w:p>
-    <w:p>
-      <w:pPr>
-        <w:pStyle w:val="ListParagraph"/>
-        <w:numPr>
-          <w:ilvl w:val="0"/>
-          <w:numId w:val="2"/>
-        </w:numPr>
-      </w:pPr>
-      <w:r>
-        <w:t>Go into the folder you want the file uploaded to in your OneDrive in SharePo</w:t>
-      </w:r>
-      <w:r>
-        <w:t>i</w:t>
-      </w:r>
-      <w:r>
-        <w:t>nt</w:t>
-      </w:r>
-      <w:r>
-        <w:t>.</w:t>
-      </w:r>
-    </w:p>
-    <w:p>
-      <w:pPr>
-        <w:pStyle w:val="ListParagraph"/>
-        <w:numPr>
-          <w:ilvl w:val="0"/>
-          <w:numId w:val="2"/>
-        </w:numPr>
-      </w:pPr>
-      <w:r>
-        <w:lastRenderedPageBreak/>
-        <w:t>Click on the blue button with rounded corners that says + Create or upload located in the top right-hand corner.</w:t>
-      </w:r>
-    </w:p>
-    <w:p>
-      <w:pPr>
-        <w:pStyle w:val="ListParagraph"/>
-        <w:numPr>
-          <w:ilvl w:val="0"/>
-          <w:numId w:val="2"/>
-        </w:numPr>
-      </w:pPr>
-      <w:r>
-        <w:t>Select the Files upload option at the top of the dropdown menu</w:t>
-      </w:r>
-      <w:r>
-        <w:t>.</w:t>
-      </w:r>
-    </w:p>
-    <w:p>
-      <w:pPr>
-        <w:pStyle w:val="ListParagraph"/>
-        <w:numPr>
-          <w:ilvl w:val="0"/>
-          <w:numId w:val="2"/>
-        </w:numPr>
-      </w:pPr>
-      <w:r>
-        <w:t>Select the Word document from the pop-up window and click on the Open button</w:t>
-      </w:r>
-      <w:r>
-        <w:t>.</w:t>
-      </w:r>
-    </w:p>
-    <w:p>
-      <w:pPr>
-        <w:pStyle w:val="ListParagraph"/>
-        <w:numPr>
-          <w:ilvl w:val="0"/>
-          <w:numId w:val="10"/>
-        </w:numPr>
-      </w:pPr>
-      <w:r>
-        <w:t>To download a document from</w:t>
-      </w:r>
-      <w:r>
-        <w:t xml:space="preserve"> </w:t>
-      </w:r>
-      <w:r>
-        <w:t>your OneDrive folder in SharePoint:</w:t>
-      </w:r>
-    </w:p>
-    <w:p>
-      <w:pPr>
-        <w:pStyle w:val="ListParagraph"/>
-        <w:numPr>
-          <w:ilvl w:val="0"/>
-          <w:numId w:val="2"/>
-        </w:numPr>
-      </w:pPr>
-      <w:r>
-        <w:t>Go to your folder in your OneDrive in SharePoint.</w:t>
-      </w:r>
-    </w:p>
-    <w:p>
-      <w:pPr>
-        <w:pStyle w:val="ListParagraph"/>
-        <w:numPr>
-          <w:ilvl w:val="0"/>
-          <w:numId w:val="2"/>
-        </w:numPr>
-      </w:pPr>
-      <w:r>
-        <w:t>Select the Download option from the top ribbon menu.</w:t>
-      </w:r>
-    </w:p>
-    <w:p>
-      <w:pPr>
-        <w:pStyle w:val="ListParagraph"/>
-        <w:numPr>
-          <w:ilvl w:val="0"/>
-          <w:numId w:val="2"/>
-        </w:numPr>
-      </w:pPr>
-      <w:r>
-        <w:t>Move the file from your local Downloads folder to your desired location for the file.</w:t>
-      </w:r>
-    </w:p>
-    <w:p>
-      <w:pPr>
-        <w:pStyle w:val="ListParagraph"/>
-        <w:numPr>
-          <w:ilvl w:val="0"/>
-          <w:numId w:val="10"/>
-        </w:numPr>
-      </w:pPr>
-      <w:r>
-        <w:t>To start a new Word document in SharePoint:</w:t>
-      </w:r>
-    </w:p>
-    <w:p>
-      <w:pPr>
-        <w:pStyle w:val="ListParagraph"/>
-        <w:numPr>
-          <w:ilvl w:val="0"/>
-          <w:numId w:val="2"/>
-        </w:numPr>
-      </w:pPr>
-      <w:r>
-        <w:t xml:space="preserve">Go into the folder you want the documents to </w:t>
-      </w:r>
-      <w:proofErr w:type="gramStart"/>
-      <w:r>
-        <w:t>be located in</w:t>
-      </w:r>
-      <w:proofErr w:type="gramEnd"/>
-      <w:r>
-        <w:t xml:space="preserve"> SharePoint.</w:t>
-      </w:r>
-    </w:p>
-    <w:p>
-      <w:pPr>
-        <w:pStyle w:val="ListParagraph"/>
-        <w:numPr>
-          <w:ilvl w:val="0"/>
-          <w:numId w:val="2"/>
-        </w:numPr>
-      </w:pPr>
-      <w:r>
-        <w:t>Click on the blue button with rounded corners that says + Create or upload located in the top right-hand corner.</w:t>
-      </w:r>
-    </w:p>
-    <w:p>
-      <w:pPr>
-        <w:pStyle w:val="ListParagraph"/>
-        <w:numPr>
-          <w:ilvl w:val="0"/>
-          <w:numId w:val="2"/>
-        </w:numPr>
-      </w:pPr>
-      <w:r>
-        <w:t xml:space="preserve">Select the Word </w:t>
-      </w:r>
-      <w:r>
-        <w:t>document</w:t>
-      </w:r>
-      <w:r>
-        <w:t xml:space="preserve"> option from the dropdown menu.</w:t>
-      </w:r>
-    </w:p>
-    <w:p>
-      <w:pPr>
-        <w:pStyle w:val="ListParagraph"/>
-        <w:numPr>
-          <w:ilvl w:val="0"/>
-          <w:numId w:val="2"/>
-        </w:numPr>
-      </w:pPr>
-      <w:r>
-        <w:t xml:space="preserve">In the new tab that </w:t>
-      </w:r>
-      <w:proofErr w:type="gramStart"/>
-      <w:r>
-        <w:t>opens up</w:t>
-      </w:r>
-      <w:proofErr w:type="gramEnd"/>
-      <w:r>
-        <w:t xml:space="preserve"> </w:t>
-      </w:r>
-      <w:r>
-        <w:t xml:space="preserve">with a Word document </w:t>
-      </w:r>
-      <w:r>
-        <w:t>name the document by clicking</w:t>
-      </w:r>
-      <w:r>
-        <w:t xml:space="preserve"> on the word Document located in the top right corner and </w:t>
-      </w:r>
-      <w:proofErr w:type="gramStart"/>
-      <w:r>
-        <w:t>replace</w:t>
-      </w:r>
-      <w:proofErr w:type="gramEnd"/>
-      <w:r>
-        <w:t xml:space="preserve"> Document with the desired name for the file.</w:t>
-      </w:r>
-    </w:p>
-    <w:p>
-      <w:pPr>
-        <w:pStyle w:val="ListParagraph"/>
-        <w:numPr>
-          <w:ilvl w:val="0"/>
-          <w:numId w:val="2"/>
-        </w:numPr>
-      </w:pPr>
-      <w:r>
-        <w:t xml:space="preserve">It is automatically saved in the </w:t>
-      </w:r>
-      <w:r>
-        <w:t>folder,</w:t>
-      </w:r>
-      <w:r>
-        <w:t xml:space="preserve"> and you will see it after you refresh the browser while in the folder.</w:t>
-      </w:r>
-    </w:p>
-    <w:p>
-      <w:pPr>
-        <w:pStyle w:val="ListParagraph"/>
-        <w:numPr>
-          <w:ilvl w:val="0"/>
-          <w:numId w:val="2"/>
-        </w:numPr>
-      </w:pPr>
-      <w:r>
-        <w:t>Changes made to the document will now automatically be saved in your folder.</w:t>
-      </w:r>
-    </w:p>
-    <w:p>
-      <w:pPr>
-        <w:pStyle w:val="ListParagraph"/>
-        <w:numPr>
-          <w:ilvl w:val="0"/>
-          <w:numId w:val="10"/>
-        </w:numPr>
-      </w:pPr>
-      <w:r>
-        <w:t xml:space="preserve">To see the </w:t>
-      </w:r>
-      <w:r>
-        <w:t>history version</w:t>
-      </w:r>
-      <w:r>
-        <w:t xml:space="preserve"> of your Word document in </w:t>
-      </w:r>
-      <w:r>
-        <w:t>SharePoint</w:t>
-      </w:r>
-    </w:p>
-    <w:p>
-      <w:pPr>
-        <w:pStyle w:val="ListParagraph"/>
-        <w:numPr>
-          <w:ilvl w:val="0"/>
-          <w:numId w:val="2"/>
-        </w:numPr>
-      </w:pPr>
-      <w:r>
-        <w:t>Go to your folder location and click on the document to open it.</w:t>
-      </w:r>
-    </w:p>
-    <w:p>
-      <w:pPr>
-        <w:pStyle w:val="ListParagraph"/>
-        <w:numPr>
-          <w:ilvl w:val="0"/>
-          <w:numId w:val="2"/>
-        </w:numPr>
-      </w:pPr>
-      <w:r>
-        <w:t>In the new window with the open document c</w:t>
-      </w:r>
-      <w:r>
-        <w:t xml:space="preserve">lick on the </w:t>
-      </w:r>
-      <w:proofErr w:type="gramStart"/>
-      <w:r>
-        <w:t>Catch up</w:t>
-      </w:r>
-      <w:proofErr w:type="gramEnd"/>
-      <w:r>
-        <w:t xml:space="preserve"> b</w:t>
-      </w:r>
-      <w:r>
-        <w:t>u</w:t>
-      </w:r>
-      <w:r>
-        <w:t>tton located on the top left-hand side</w:t>
-      </w:r>
-      <w:r>
-        <w:t xml:space="preserve"> of the window.</w:t>
-      </w:r>
-    </w:p>
-    <w:p>
-      <w:pPr>
-        <w:pStyle w:val="ListParagraph"/>
-        <w:numPr>
-          <w:ilvl w:val="0"/>
-          <w:numId w:val="2"/>
-        </w:numPr>
-      </w:pPr>
-      <w:r>
-        <w:t>Click on the Version History link that is listed in the pop-up window.</w:t>
-      </w:r>
-    </w:p>
-    <w:p>
-      <w:pPr>
-        <w:pStyle w:val="ListParagraph"/>
-        <w:numPr>
-          <w:ilvl w:val="0"/>
-          <w:numId w:val="2"/>
-        </w:numPr>
-      </w:pPr>
-      <w:r>
-        <w:t>Click on the point you version time stamp you want to see.</w:t>
-      </w:r>
-    </w:p>
-    <w:p>
-      <w:pPr>
-        <w:pStyle w:val="ListParagraph"/>
-        <w:numPr>
-          <w:ilvl w:val="0"/>
-          <w:numId w:val="2"/>
-        </w:numPr>
-      </w:pPr>
-      <w:r>
-        <w:t xml:space="preserve">You can also select at the top of the Version History to Show Edits by turning on the Show </w:t>
-      </w:r>
-      <w:proofErr w:type="gramStart"/>
-      <w:r>
-        <w:t>edits</w:t>
-      </w:r>
-      <w:proofErr w:type="gramEnd"/>
-      <w:r>
-        <w:t xml:space="preserve"> button</w:t>
-      </w:r>
-    </w:p>
-    <w:p>
-      <w:pPr>
-        <w:pStyle w:val="ListParagraph"/>
-        <w:numPr>
-          <w:ilvl w:val="0"/>
-          <w:numId w:val="10"/>
-        </w:numPr>
-      </w:pPr>
-      <w:r>
-        <w:t>To work on the same Word document at the same time and see edits as you work:</w:t>
-      </w:r>
-    </w:p>
-    <w:p>
-      <w:pPr>
-        <w:pStyle w:val="ListParagraph"/>
-        <w:numPr>
-          <w:ilvl w:val="0"/>
-          <w:numId w:val="2"/>
-        </w:numPr>
-      </w:pPr>
-      <w:r>
-        <w:t>Option 1 - from the Word document:</w:t>
-      </w:r>
-    </w:p>
-    <w:p>
-      <w:pPr>
-        <w:pStyle w:val="ListParagraph"/>
-        <w:numPr>
-          <w:ilvl w:val="1"/>
-          <w:numId w:val="2"/>
-        </w:numPr>
-      </w:pPr>
-      <w:r>
-        <w:t>While in the Word document window select the Share dropdown menu located on the top left-hand side of the window.</w:t>
-      </w:r>
-    </w:p>
-    <w:p>
-      <w:pPr>
-        <w:pStyle w:val="ListParagraph"/>
-        <w:numPr>
-          <w:ilvl w:val="1"/>
-          <w:numId w:val="2"/>
-        </w:numPr>
-      </w:pPr>
-      <w:r>
-        <w:t xml:space="preserve">Click the Share option from the </w:t>
-      </w:r>
-      <w:r>
-        <w:t>dropdown</w:t>
-      </w:r>
-      <w:r>
-        <w:t xml:space="preserve"> list.</w:t>
-      </w:r>
-    </w:p>
-    <w:p>
-      <w:pPr>
-        <w:pStyle w:val="ListParagraph"/>
-        <w:numPr>
-          <w:ilvl w:val="1"/>
-          <w:numId w:val="2"/>
-        </w:numPr>
-      </w:pPr>
-      <w:r>
-        <w:t>Then proceed with the steps below.</w:t>
-      </w:r>
-    </w:p>
-    <w:p>
-      <w:pPr>
-        <w:pStyle w:val="ListParagraph"/>
-        <w:numPr>
-          <w:ilvl w:val="0"/>
-          <w:numId w:val="2"/>
-        </w:numPr>
-      </w:pPr>
-      <w:r>
-        <w:t>Option 2 - from the Folder containing the Word document:</w:t>
-      </w:r>
-    </w:p>
-    <w:p>
-      <w:pPr>
-        <w:pStyle w:val="ListParagraph"/>
-        <w:numPr>
-          <w:ilvl w:val="1"/>
-          <w:numId w:val="2"/>
-        </w:numPr>
-      </w:pPr>
-      <w:r>
-        <w:t>Select the document or documents you want to collaborate on by checking the white dot that appears next to the document on the left when you hover over the document.</w:t>
-      </w:r>
-    </w:p>
-    <w:p>
-      <w:pPr>
-        <w:pStyle w:val="ListParagraph"/>
-        <w:numPr>
-          <w:ilvl w:val="1"/>
-          <w:numId w:val="2"/>
-        </w:numPr>
-      </w:pPr>
-      <w:r>
-        <w:t>Then click on the share button located on the top tool ribbon.</w:t>
-      </w:r>
-    </w:p>
-    <w:p>
-      <w:pPr>
-        <w:pStyle w:val="ListParagraph"/>
-        <w:numPr>
-          <w:ilvl w:val="1"/>
-          <w:numId w:val="2"/>
-        </w:numPr>
-      </w:pPr>
-      <w:r>
-        <w:t>Then proceed with the steps below.</w:t>
-      </w:r>
-    </w:p>
-    <w:p>
-      <w:pPr>
-        <w:pStyle w:val="ListParagraph"/>
-        <w:numPr>
-          <w:ilvl w:val="0"/>
-          <w:numId w:val="2"/>
-        </w:numPr>
-      </w:pPr>
-      <w:r>
-        <w:t xml:space="preserve">In the </w:t>
-      </w:r>
-      <w:r>
-        <w:t>pop-up</w:t>
-      </w:r>
-      <w:r>
-        <w:t xml:space="preserve"> window enter the BYUI email address of the person you want to collaborate with.</w:t>
-      </w:r>
-    </w:p>
-    <w:p>
-      <w:pPr>
-        <w:pStyle w:val="ListParagraph"/>
-        <w:numPr>
-          <w:ilvl w:val="0"/>
-          <w:numId w:val="2"/>
-        </w:numPr>
-      </w:pPr>
-      <w:r>
-        <w:t xml:space="preserve">Click on the Settings symbol next to the Copy link in the same popup window and make sure that under </w:t>
-      </w:r>
-      <w:r>
-        <w:t>the</w:t>
-      </w:r>
-      <w:r>
-        <w:t xml:space="preserve"> link works for heading People you choose is selected and under the More settings heading Can edit is selected.</w:t>
-      </w:r>
-      <w:r>
-        <w:t xml:space="preserve"> If you </w:t>
-      </w:r>
-      <w:proofErr w:type="gramStart"/>
-      <w:r>
-        <w:t>have to</w:t>
-      </w:r>
-      <w:proofErr w:type="gramEnd"/>
-      <w:r>
-        <w:t xml:space="preserve"> change the </w:t>
-      </w:r>
-      <w:r>
-        <w:lastRenderedPageBreak/>
-        <w:t>settings,</w:t>
-      </w:r>
-      <w:r>
-        <w:t xml:space="preserve"> click the Apply button, otherwise if the </w:t>
-      </w:r>
-      <w:r>
-        <w:t>settings</w:t>
-      </w:r>
-      <w:r>
-        <w:t xml:space="preserve"> are </w:t>
-      </w:r>
-      <w:r>
-        <w:t>correct,</w:t>
-      </w:r>
-      <w:r>
-        <w:t xml:space="preserve"> you can X out of the settings.</w:t>
-      </w:r>
-    </w:p>
-    <w:p>
-      <w:pPr>
-        <w:pStyle w:val="ListParagraph"/>
-        <w:numPr>
-          <w:ilvl w:val="0"/>
-          <w:numId w:val="2"/>
-        </w:numPr>
-      </w:pPr>
-      <w:r>
-        <w:t>Copy the link to the document and paste it into the Add a message window.</w:t>
-      </w:r>
-    </w:p>
-    <w:p>
-      <w:pPr>
-        <w:pStyle w:val="ListParagraph"/>
-        <w:numPr>
-          <w:ilvl w:val="0"/>
-          <w:numId w:val="2"/>
-        </w:numPr>
-      </w:pPr>
-      <w:r>
-        <w:t>Hover over the pencil icon next to the email you entered and make sure it says Can edit (If it doesn't click on the dropdown arrow and select Can edit)</w:t>
-      </w:r>
-    </w:p>
-    <w:p>
-      <w:pPr>
-        <w:pStyle w:val="ListParagraph"/>
-        <w:numPr>
-          <w:ilvl w:val="0"/>
-          <w:numId w:val="2"/>
-        </w:numPr>
-      </w:pPr>
-      <w:r>
-        <w:t>Click on the Send button</w:t>
-      </w:r>
-    </w:p>
-    <w:p>
-      <w:pPr>
-        <w:pStyle w:val="ListParagraph"/>
-        <w:numPr>
-          <w:ilvl w:val="0"/>
-          <w:numId w:val="2"/>
-        </w:numPr>
-      </w:pPr>
-      <w:r>
-        <w:t>Now you can both open the document and work on it together and you will see each other's names at the top, colored cursors, and edits will appear in real time.</w:t>
-      </w:r>
-    </w:p>
-    <w:p>
-      <w:pPr>
-        <w:pStyle w:val="Sub-Info"/>
-        <w:rPr>
-          <w:rFonts w:eastAsia="Times New Roman"/>
-        </w:rPr>
-      </w:pPr>
-      <w:r>
-        <w:rPr>
-          <w:rFonts w:eastAsia="Times New Roman"/>
-        </w:rPr>
-        <w:t>Trello</w:t>
-      </w:r>
-    </w:p>
-    <w:p>
-      <w:pPr>
-        <w:pStyle w:val="ListParagraph"/>
-        <w:numPr>
-          <w:ilvl w:val="0"/>
-          <w:numId w:val="12"/>
-        </w:numPr>
-      </w:pPr>
-      <w:r>
-        <w:t xml:space="preserve">You will need to accept the </w:t>
-      </w:r>
-      <w:r>
-        <w:t xml:space="preserve">Join request invitation that was sent to your BYUI email. </w:t>
-      </w:r>
-      <w:hyperlink r:id="rId16" w:history="1">
+        <w:t xml:space="preserve"> SDD Task Tracker" on the right of the "Posts" and "Shared" tabs at the top of the General Channel. Link: </w:t>
+      </w:r>
+      <w:hyperlink r:id="rId16" w:tooltip="https://teams.microsoft.com/l/entity/com.microsoft.teamspace.tab.planner/_djb2_msteams_prefix_4017385990?context=%7B%22channelId%22%3A%2219%3Ad8pFcXWYsE-Es9WJSnScm6r1CQZ21Ad63NXz8YjLgUQ1%40thread.tacv2%22%7D&amp;tenantId=e6ac1d1f-d695-4ef1-91d4-94cddef8be11" w:history="1">
+        <w:proofErr w:type="spellStart"/>
         <w:r>
           <w:rPr>
             <w:rStyle w:val="Hyperlink"/>
           </w:rPr>
-          <w:t>https://trello.com/invite/b/69f51da0530397d9ac372de7/ATTId09c87151397902b20b8940ec84bda8bDACAF0F2/careerbound-sdd</w:t>
+          <w:t>CareerBound</w:t>
+        </w:r>
+        <w:proofErr w:type="spellEnd"/>
+        <w:r>
+          <w:rPr>
+            <w:rStyle w:val="Hyperlink"/>
+          </w:rPr>
+          <w:t xml:space="preserve"> SDD Task Tracker</w:t>
         </w:r>
       </w:hyperlink>
-      <w:r>
-        <w:t xml:space="preserve"> Then you will be able to access and work on the Trello board.</w:t>
-      </w:r>
     </w:p>
     <w:p>
       <w:pPr>
@@ -2455,6 +2498,67 @@
         </w:numPr>
       </w:pPr>
       <w:r>
+        <w:t>This board will be used to track all assignments and their progress</w:t>
+      </w:r>
+      <w:r>
+        <w:t xml:space="preserve"> using the provided list buckets by adding a card to </w:t>
+      </w:r>
+      <w:proofErr w:type="spellStart"/>
+      <w:proofErr w:type="gramStart"/>
+      <w:r>
+        <w:t>To</w:t>
+      </w:r>
+      <w:proofErr w:type="spellEnd"/>
+      <w:proofErr w:type="gramEnd"/>
+      <w:r>
+        <w:t xml:space="preserve"> do when assigned and dragging the card to the next list until it is complete</w:t>
+      </w:r>
+      <w:r>
+        <w:t>.</w:t>
+      </w:r>
+    </w:p>
+    <w:p>
+      <w:pPr>
+        <w:pStyle w:val="ListParagraph"/>
+        <w:numPr>
+          <w:ilvl w:val="0"/>
+          <w:numId w:val="12"/>
+        </w:numPr>
+      </w:pPr>
+      <w:r>
+        <w:t>Keep the "Creating Tasks Instructions</w:t>
+      </w:r>
+      <w:r>
+        <w:t>"</w:t>
+      </w:r>
+      <w:r>
+        <w:t xml:space="preserve"> at the top of the "To do" list</w:t>
+      </w:r>
+      <w:r>
+        <w:t xml:space="preserve"> and the "</w:t>
+      </w:r>
+      <w:r>
+        <w:t>Task</w:t>
+      </w:r>
+      <w:r>
+        <w:t xml:space="preserve"> </w:t>
+      </w:r>
+      <w:r>
+        <w:t>Update</w:t>
+      </w:r>
+      <w:r>
+        <w:t xml:space="preserve"> Instructions" at the top of each list.</w:t>
+      </w:r>
+    </w:p>
+    <w:p>
+      <w:pPr>
+        <w:pStyle w:val="ListParagraph"/>
+        <w:numPr>
+          <w:ilvl w:val="0"/>
+          <w:numId w:val="12"/>
+        </w:numPr>
+      </w:pPr>
+      <w:r>
         <w:t>To create a new card:</w:t>
       </w:r>
     </w:p>
@@ -2467,16 +2571,34 @@
         </w:numPr>
       </w:pPr>
       <w:r>
-        <w:t xml:space="preserve">Click on the Add </w:t>
+        <w:t xml:space="preserve">Click on the </w:t>
+      </w:r>
+      <w:r>
+        <w:t xml:space="preserve">+ </w:t>
+      </w:r>
+      <w:r>
+        <w:t xml:space="preserve">Add </w:t>
+      </w:r>
+      <w:r>
+        <w:t>Task</w:t>
+      </w:r>
+      <w:r>
+        <w:t xml:space="preserve"> at the </w:t>
+      </w:r>
+      <w:r>
+        <w:t>top</w:t>
+      </w:r>
+      <w:r>
+        <w:t xml:space="preserve"> of the list</w:t>
+      </w:r>
+      <w:r>
+        <w:t xml:space="preserve"> </w:t>
       </w:r>
       <w:proofErr w:type="gramStart"/>
       <w:r>
-        <w:t>a card</w:t>
+        <w:t>and .</w:t>
       </w:r>
       <w:proofErr w:type="gramEnd"/>
-      <w:r>
-        <w:t xml:space="preserve"> at the bottom of the list or click on the three dots at the top of the list next to the name and select Add card.</w:t>
-      </w:r>
     </w:p>
     <w:p>
       <w:pPr>
@@ -2489,34 +2611,299 @@
       <w:r>
         <w:t xml:space="preserve">Enter </w:t>
       </w:r>
-      <w:r>
-        <w:t xml:space="preserve">your team's name in parenthesis and then </w:t>
-      </w:r>
-      <w:r>
-        <w:t>a title describing the task to be accomplished and click on Add card.</w:t>
-      </w:r>
-    </w:p>
-    <w:p>
-      <w:pPr>
-        <w:pStyle w:val="ListParagraph"/>
-        <w:numPr>
-          <w:ilvl w:val="0"/>
-          <w:numId w:val="2"/>
-        </w:numPr>
-      </w:pPr>
-      <w:r>
-        <w:t>Click on the newly created card and click on the Members button and click on the person it is assigned to.</w:t>
+      <w:proofErr w:type="gramStart"/>
+      <w:r>
+        <w:t xml:space="preserve">a </w:t>
+      </w:r>
+      <w:r>
+        <w:t>the</w:t>
+      </w:r>
+      <w:proofErr w:type="gramEnd"/>
+      <w:r>
+        <w:t xml:space="preserve"> descri</w:t>
+      </w:r>
+      <w:r>
+        <w:t>ption of</w:t>
+      </w:r>
+      <w:r>
+        <w:t xml:space="preserve"> the task to be accomplished </w:t>
+      </w:r>
+      <w:r>
+        <w:t>in the task name.</w:t>
+      </w:r>
+    </w:p>
+    <w:p>
+      <w:pPr>
+        <w:pStyle w:val="ListParagraph"/>
+        <w:numPr>
+          <w:ilvl w:val="0"/>
+          <w:numId w:val="2"/>
+        </w:numPr>
+      </w:pPr>
+      <w:r>
+        <w:t xml:space="preserve">Click on Assign and assign it to a member of your team. </w:t>
+      </w:r>
+    </w:p>
+    <w:p>
+      <w:pPr>
+        <w:pStyle w:val="ListParagraph"/>
+        <w:numPr>
+          <w:ilvl w:val="0"/>
+          <w:numId w:val="2"/>
+        </w:numPr>
+      </w:pPr>
+      <w:r>
+        <w:t>C</w:t>
+      </w:r>
+      <w:r>
+        <w:t xml:space="preserve">lick on Add </w:t>
+      </w:r>
+      <w:r>
+        <w:t>task</w:t>
+      </w:r>
+      <w:r>
+        <w:t>.</w:t>
+      </w:r>
+    </w:p>
+    <w:p>
+      <w:pPr>
+        <w:pStyle w:val="ListParagraph"/>
+        <w:numPr>
+          <w:ilvl w:val="0"/>
+          <w:numId w:val="2"/>
+        </w:numPr>
+      </w:pPr>
+      <w:r>
+        <w:t>C</w:t>
+      </w:r>
+      <w:r>
+        <w:t xml:space="preserve">lick on the </w:t>
+      </w:r>
+      <w:r>
+        <w:t xml:space="preserve">created card and click on the </w:t>
+      </w:r>
+      <w:r>
+        <w:t>Add label</w:t>
+      </w:r>
+      <w:r>
+        <w:t xml:space="preserve"> button</w:t>
+      </w:r>
+      <w:r>
+        <w:t>, type in the word "team"</w:t>
+      </w:r>
+      <w:r>
+        <w:t xml:space="preserve"> and click on </w:t>
+      </w:r>
+      <w:r>
+        <w:t xml:space="preserve">your </w:t>
+      </w:r>
+      <w:r>
+        <w:t>T</w:t>
+      </w:r>
+      <w:r>
+        <w:t>eam's</w:t>
       </w:r>
       <w:r>
         <w:t xml:space="preserve"> </w:t>
       </w:r>
+      <w:r>
+        <w:t>matching</w:t>
+      </w:r>
+      <w:r>
+        <w:t xml:space="preserve"> </w:t>
+      </w:r>
+      <w:r>
+        <w:t xml:space="preserve">label or click on the three dots on the top right of the card and select your </w:t>
+      </w:r>
+      <w:r>
+        <w:t>T</w:t>
+      </w:r>
+      <w:r>
+        <w:t xml:space="preserve">eams </w:t>
+      </w:r>
+      <w:r>
+        <w:t>Matching</w:t>
+      </w:r>
+      <w:r>
+        <w:t xml:space="preserve"> Label</w:t>
+      </w:r>
+      <w:r>
+        <w:t>.</w:t>
+      </w:r>
+    </w:p>
+    <w:p>
+      <w:pPr>
+        <w:pStyle w:val="ListParagraph"/>
+        <w:numPr>
+          <w:ilvl w:val="0"/>
+          <w:numId w:val="12"/>
+        </w:numPr>
+      </w:pPr>
+      <w:r>
+        <w:t xml:space="preserve">To quickly find </w:t>
+      </w:r>
       <w:proofErr w:type="gramStart"/>
       <w:r>
-        <w:t>The click</w:t>
+        <w:t xml:space="preserve">your </w:t>
+      </w:r>
+      <w:r>
+        <w:t>all</w:t>
       </w:r>
       <w:proofErr w:type="gramEnd"/>
       <w:r>
-        <w:t xml:space="preserve"> on Labels and type t into the search and select the matching team label.</w:t>
+        <w:t xml:space="preserve"> your team's </w:t>
+      </w:r>
+      <w:r>
+        <w:t>card</w:t>
+      </w:r>
+      <w:r>
+        <w:t>s</w:t>
+      </w:r>
+      <w:r>
+        <w:t xml:space="preserve"> in the list:</w:t>
+      </w:r>
+    </w:p>
+    <w:p>
+      <w:pPr>
+        <w:pStyle w:val="ListParagraph"/>
+        <w:numPr>
+          <w:ilvl w:val="0"/>
+          <w:numId w:val="2"/>
+        </w:numPr>
+      </w:pPr>
+      <w:r>
+        <w:t xml:space="preserve">Click </w:t>
+      </w:r>
+      <w:r>
+        <w:t xml:space="preserve">on </w:t>
+      </w:r>
+      <w:r>
+        <w:t xml:space="preserve">the </w:t>
+      </w:r>
+      <w:r>
+        <w:t xml:space="preserve">Available filters button </w:t>
+      </w:r>
+      <w:r>
+        <w:rPr>
+          <w:noProof/>
+          <w:position w:val="-10"/>
+        </w:rPr>
+        <w:drawing>
+          <wp:inline distT="0" distB="0" distL="0" distR="0" wp14:anchorId="190315EF" wp14:editId="266D3BC8">
+            <wp:extent cx="228600" cy="219075"/>
+            <wp:effectExtent l="0" t="0" r="0" b="9525"/>
+            <wp:docPr id="2036120494" name="Picture 1"/>
+            <wp:cNvGraphicFramePr>
+              <a:graphicFrameLocks xmlns:a="http://schemas.openxmlformats.org/drawingml/2006/main" noChangeAspect="1"/>
+            </wp:cNvGraphicFramePr>
+            <a:graphic xmlns:a="http://schemas.openxmlformats.org/drawingml/2006/main">
+              <a:graphicData uri="http://schemas.openxmlformats.org/drawingml/2006/picture">
+                <pic:pic xmlns:pic="http://schemas.openxmlformats.org/drawingml/2006/picture">
+                  <pic:nvPicPr>
+                    <pic:cNvPr id="2036120494" name=""/>
+                    <pic:cNvPicPr/>
+                  </pic:nvPicPr>
+                  <pic:blipFill>
+                    <a:blip r:embed="rId17"/>
+                    <a:stretch>
+                      <a:fillRect/>
+                    </a:stretch>
+                  </pic:blipFill>
+                  <pic:spPr>
+                    <a:xfrm>
+                      <a:off x="0" y="0"/>
+                      <a:ext cx="228600" cy="219075"/>
+                    </a:xfrm>
+                    <a:prstGeom prst="rect">
+                      <a:avLst/>
+                    </a:prstGeom>
+                  </pic:spPr>
+                </pic:pic>
+              </a:graphicData>
+            </a:graphic>
+          </wp:inline>
+        </w:drawing>
+      </w:r>
+      <w:r>
+        <w:t>located at the top</w:t>
+      </w:r>
+      <w:r>
+        <w:t xml:space="preserve"> and to the right of </w:t>
+      </w:r>
+      <w:r>
+        <w:t xml:space="preserve">the </w:t>
+      </w:r>
+      <w:r>
+        <w:t>oval "</w:t>
+      </w:r>
+      <w:r>
+        <w:t>Charts</w:t>
+      </w:r>
+      <w:r>
+        <w:t>"</w:t>
+      </w:r>
+      <w:r>
+        <w:t xml:space="preserve"> Planner </w:t>
+      </w:r>
+      <w:r>
+        <w:t xml:space="preserve">button </w:t>
+      </w:r>
+      <w:r>
+        <w:t>tab</w:t>
+      </w:r>
+      <w:r>
+        <w:t>.</w:t>
+      </w:r>
+    </w:p>
+    <w:p>
+      <w:pPr>
+        <w:pStyle w:val="ListParagraph"/>
+        <w:numPr>
+          <w:ilvl w:val="0"/>
+          <w:numId w:val="2"/>
+        </w:numPr>
+      </w:pPr>
+      <w:r>
+        <w:t>In</w:t>
+      </w:r>
+      <w:r>
+        <w:t xml:space="preserve"> the dropdown menu </w:t>
+      </w:r>
+      <w:r>
+        <w:t xml:space="preserve">hover over Labels and </w:t>
+      </w:r>
+      <w:r>
+        <w:t xml:space="preserve">select </w:t>
+      </w:r>
+      <w:r>
+        <w:t xml:space="preserve">your Team's </w:t>
+      </w:r>
+      <w:r>
+        <w:t>matching</w:t>
+      </w:r>
+      <w:r>
+        <w:t xml:space="preserve"> label</w:t>
+      </w:r>
+      <w:r>
+        <w:t>.</w:t>
+      </w:r>
+    </w:p>
+    <w:p>
+      <w:pPr>
+        <w:pStyle w:val="ListParagraph"/>
+        <w:numPr>
+          <w:ilvl w:val="0"/>
+          <w:numId w:val="2"/>
+        </w:numPr>
+      </w:pPr>
+      <w:r>
+        <w:t>After your Team's label shows a check</w:t>
+      </w:r>
+      <w:r>
+        <w:t>,</w:t>
+      </w:r>
+      <w:r>
+        <w:t xml:space="preserve"> only cards with your Team's label will show.</w:t>
       </w:r>
     </w:p>
     <w:p>
@@ -2528,63 +2915,312 @@
         </w:numPr>
       </w:pPr>
       <w:r>
-        <w:t>To quickly find your card in the list:</w:t>
-      </w:r>
-    </w:p>
-    <w:p>
-      <w:pPr>
-        <w:pStyle w:val="ListParagraph"/>
-        <w:numPr>
-          <w:ilvl w:val="0"/>
-          <w:numId w:val="2"/>
-        </w:numPr>
-      </w:pPr>
-      <w:r>
-        <w:t>Click on the three dots at the top of the list.</w:t>
-      </w:r>
-    </w:p>
-    <w:p>
-      <w:pPr>
-        <w:pStyle w:val="ListParagraph"/>
-        <w:numPr>
-          <w:ilvl w:val="0"/>
-          <w:numId w:val="2"/>
-        </w:numPr>
-      </w:pPr>
-      <w:r>
-        <w:t>From the dropdown menu select Sort by</w:t>
-      </w:r>
-    </w:p>
-    <w:p>
-      <w:pPr>
-        <w:pStyle w:val="ListParagraph"/>
-        <w:numPr>
-          <w:ilvl w:val="0"/>
-          <w:numId w:val="2"/>
-        </w:numPr>
-      </w:pPr>
-      <w:r>
-        <w:t>From the dropdown menu select Card name (alphabetically)</w:t>
-      </w:r>
-    </w:p>
-    <w:p>
-      <w:pPr>
-        <w:pStyle w:val="ListParagraph"/>
-        <w:numPr>
-          <w:ilvl w:val="0"/>
-          <w:numId w:val="2"/>
-        </w:numPr>
-      </w:pPr>
-      <w:r>
-        <w:t xml:space="preserve">Scroll to the list of your </w:t>
+        <w:t>To quickly find your personally assigned cards in the list:</w:t>
+      </w:r>
+    </w:p>
+    <w:p>
+      <w:pPr>
+        <w:pStyle w:val="ListParagraph"/>
+        <w:numPr>
+          <w:ilvl w:val="0"/>
+          <w:numId w:val="2"/>
+        </w:numPr>
+      </w:pPr>
+      <w:r>
+        <w:t xml:space="preserve">Click on the Available filters button </w:t>
+      </w:r>
+      <w:r>
+        <w:rPr>
+          <w:noProof/>
+          <w:position w:val="-10"/>
+        </w:rPr>
+        <w:drawing>
+          <wp:inline distT="0" distB="0" distL="0" distR="0" wp14:anchorId="697F8BAD" wp14:editId="5D1E484F">
+            <wp:extent cx="228600" cy="219075"/>
+            <wp:effectExtent l="0" t="0" r="0" b="9525"/>
+            <wp:docPr id="1757808056" name="Picture 1"/>
+            <wp:cNvGraphicFramePr>
+              <a:graphicFrameLocks xmlns:a="http://schemas.openxmlformats.org/drawingml/2006/main" noChangeAspect="1"/>
+            </wp:cNvGraphicFramePr>
+            <a:graphic xmlns:a="http://schemas.openxmlformats.org/drawingml/2006/main">
+              <a:graphicData uri="http://schemas.openxmlformats.org/drawingml/2006/picture">
+                <pic:pic xmlns:pic="http://schemas.openxmlformats.org/drawingml/2006/picture">
+                  <pic:nvPicPr>
+                    <pic:cNvPr id="2036120494" name=""/>
+                    <pic:cNvPicPr/>
+                  </pic:nvPicPr>
+                  <pic:blipFill>
+                    <a:blip r:embed="rId17"/>
+                    <a:stretch>
+                      <a:fillRect/>
+                    </a:stretch>
+                  </pic:blipFill>
+                  <pic:spPr>
+                    <a:xfrm>
+                      <a:off x="0" y="0"/>
+                      <a:ext cx="228600" cy="219075"/>
+                    </a:xfrm>
+                    <a:prstGeom prst="rect">
+                      <a:avLst/>
+                    </a:prstGeom>
+                  </pic:spPr>
+                </pic:pic>
+              </a:graphicData>
+            </a:graphic>
+          </wp:inline>
+        </w:drawing>
+      </w:r>
+      <w:r>
+        <w:t>located at the top and to the right of the oval "Charts" Planner button tab.</w:t>
+      </w:r>
+    </w:p>
+    <w:p>
+      <w:pPr>
+        <w:pStyle w:val="ListParagraph"/>
+        <w:numPr>
+          <w:ilvl w:val="0"/>
+          <w:numId w:val="2"/>
+        </w:numPr>
+      </w:pPr>
+      <w:r>
+        <w:t>In the dropdown menu hover over</w:t>
+      </w:r>
+      <w:r>
+        <w:t xml:space="preserve"> </w:t>
+      </w:r>
+      <w:r>
+        <w:t>Assignment and select your name from the list.</w:t>
+      </w:r>
+    </w:p>
+    <w:p>
+      <w:pPr>
+        <w:pStyle w:val="ListParagraph"/>
+        <w:numPr>
+          <w:ilvl w:val="0"/>
+          <w:numId w:val="2"/>
+        </w:numPr>
+      </w:pPr>
+      <w:r>
+        <w:t>After your name shows a check, only cards with your name will show.</w:t>
+      </w:r>
+    </w:p>
+    <w:p>
+      <w:pPr>
+        <w:pStyle w:val="ListParagraph"/>
+        <w:numPr>
+          <w:ilvl w:val="0"/>
+          <w:numId w:val="12"/>
+        </w:numPr>
+      </w:pPr>
+      <w:r>
+        <w:t xml:space="preserve">To </w:t>
+      </w:r>
+      <w:r>
+        <w:t>k</w:t>
+      </w:r>
+      <w:r>
+        <w:t xml:space="preserve">eep the Pinned Instruction Cards </w:t>
+      </w:r>
+      <w:r>
+        <w:t>while filtering:</w:t>
+      </w:r>
+    </w:p>
+    <w:p>
+      <w:pPr>
+        <w:pStyle w:val="ListParagraph"/>
+        <w:numPr>
+          <w:ilvl w:val="0"/>
+          <w:numId w:val="2"/>
+        </w:numPr>
+      </w:pPr>
+      <w:r>
+        <w:t xml:space="preserve">Click on the Available filters button </w:t>
+      </w:r>
+      <w:r>
+        <w:rPr>
+          <w:noProof/>
+          <w:position w:val="-10"/>
+        </w:rPr>
+        <w:drawing>
+          <wp:inline distT="0" distB="0" distL="0" distR="0" wp14:anchorId="03AF9828" wp14:editId="026CEF68">
+            <wp:extent cx="228600" cy="219075"/>
+            <wp:effectExtent l="0" t="0" r="0" b="9525"/>
+            <wp:docPr id="225519539" name="Picture 1"/>
+            <wp:cNvGraphicFramePr>
+              <a:graphicFrameLocks xmlns:a="http://schemas.openxmlformats.org/drawingml/2006/main" noChangeAspect="1"/>
+            </wp:cNvGraphicFramePr>
+            <a:graphic xmlns:a="http://schemas.openxmlformats.org/drawingml/2006/main">
+              <a:graphicData uri="http://schemas.openxmlformats.org/drawingml/2006/picture">
+                <pic:pic xmlns:pic="http://schemas.openxmlformats.org/drawingml/2006/picture">
+                  <pic:nvPicPr>
+                    <pic:cNvPr id="2036120494" name=""/>
+                    <pic:cNvPicPr/>
+                  </pic:nvPicPr>
+                  <pic:blipFill>
+                    <a:blip r:embed="rId17"/>
+                    <a:stretch>
+                      <a:fillRect/>
+                    </a:stretch>
+                  </pic:blipFill>
+                  <pic:spPr>
+                    <a:xfrm>
+                      <a:off x="0" y="0"/>
+                      <a:ext cx="228600" cy="219075"/>
+                    </a:xfrm>
+                    <a:prstGeom prst="rect">
+                      <a:avLst/>
+                    </a:prstGeom>
+                  </pic:spPr>
+                </pic:pic>
+              </a:graphicData>
+            </a:graphic>
+          </wp:inline>
+        </w:drawing>
+      </w:r>
+      <w:r>
+        <w:t>located at the top and to the right of the oval "Charts" Planner button tab.</w:t>
+      </w:r>
+    </w:p>
+    <w:p>
+      <w:pPr>
+        <w:pStyle w:val="ListParagraph"/>
+        <w:numPr>
+          <w:ilvl w:val="0"/>
+          <w:numId w:val="2"/>
+        </w:numPr>
+      </w:pPr>
+      <w:r>
+        <w:t xml:space="preserve">In the dropdown menu hover over </w:t>
+      </w:r>
+      <w:r>
+        <w:t>Labels and select</w:t>
+      </w:r>
+      <w:r>
+        <w:t xml:space="preserve"> </w:t>
+      </w:r>
+      <w:r>
+        <w:t>the "!!!KEEP AT TOP!!! label</w:t>
+      </w:r>
+      <w:r>
+        <w:t xml:space="preserve"> from the list.</w:t>
+      </w:r>
+    </w:p>
+    <w:p>
+      <w:pPr>
+        <w:pStyle w:val="ListParagraph"/>
+        <w:numPr>
+          <w:ilvl w:val="0"/>
+          <w:numId w:val="2"/>
+        </w:numPr>
+      </w:pPr>
+      <w:r>
+        <w:t xml:space="preserve">After </w:t>
+      </w:r>
+      <w:r>
+        <w:t>the "!!!KEEP AT TOP!!! label</w:t>
+      </w:r>
+      <w:r>
+        <w:t xml:space="preserve"> </w:t>
+      </w:r>
+      <w:r>
+        <w:t xml:space="preserve">and your other filter item </w:t>
+      </w:r>
+      <w:r>
+        <w:t>show a check</w:t>
+      </w:r>
+      <w:r>
+        <w:t xml:space="preserve"> by them</w:t>
+      </w:r>
+      <w:r>
+        <w:t xml:space="preserve">, only </w:t>
+      </w:r>
+      <w:r>
+        <w:t xml:space="preserve">those </w:t>
+      </w:r>
+      <w:r>
+        <w:t xml:space="preserve">cards </w:t>
+      </w:r>
+      <w:r>
+        <w:t>with the Instruction cards will</w:t>
+      </w:r>
+      <w:r>
+        <w:t xml:space="preserve"> show.</w:t>
+      </w:r>
+    </w:p>
+    <w:p>
+      <w:pPr>
+        <w:pStyle w:val="ListParagraph"/>
+        <w:numPr>
+          <w:ilvl w:val="0"/>
+          <w:numId w:val="12"/>
+        </w:numPr>
+      </w:pPr>
+      <w:r>
+        <w:t xml:space="preserve">To get </w:t>
       </w:r>
       <w:proofErr w:type="gramStart"/>
       <w:r>
-        <w:t>teams</w:t>
+        <w:t>notif</w:t>
+      </w:r>
+      <w:r>
+        <w:t>y</w:t>
       </w:r>
       <w:proofErr w:type="gramEnd"/>
       <w:r>
-        <w:t xml:space="preserve"> cards and find your assigned cards.</w:t>
+        <w:t xml:space="preserve"> </w:t>
+      </w:r>
+      <w:r>
+        <w:t xml:space="preserve">your Team Lead </w:t>
+      </w:r>
+      <w:r>
+        <w:t>when a change in status is made to a card:</w:t>
+      </w:r>
+    </w:p>
+    <w:p>
+      <w:pPr>
+        <w:pStyle w:val="ListParagraph"/>
+        <w:numPr>
+          <w:ilvl w:val="0"/>
+          <w:numId w:val="2"/>
+        </w:numPr>
+      </w:pPr>
+      <w:r>
+        <w:t xml:space="preserve">With each move you </w:t>
+      </w:r>
+      <w:proofErr w:type="gramStart"/>
+      <w:r>
+        <w:t>must @</w:t>
+      </w:r>
+      <w:proofErr w:type="gramEnd"/>
+      <w:r>
+        <w:t>m</w:t>
+      </w:r>
+      <w:r>
+        <w:t>ention your Team Lead what List you are moving the card into in the Card's Notes section located at the bottom of the Task Card.</w:t>
+      </w:r>
+    </w:p>
+    <w:p>
+      <w:pPr>
+        <w:pStyle w:val="ListParagraph"/>
+        <w:numPr>
+          <w:ilvl w:val="0"/>
+          <w:numId w:val="2"/>
+        </w:numPr>
+      </w:pPr>
+      <w:proofErr w:type="gramStart"/>
+      <w:r>
+        <w:lastRenderedPageBreak/>
+        <w:t>The @</w:t>
+      </w:r>
+      <w:proofErr w:type="gramEnd"/>
+      <w:r>
+        <w:t>m</w:t>
+      </w:r>
+      <w:r>
+        <w:t>ention in the Card's Notes section will notify the Team Lead of the move and adding the destination list will tell the Team Lead what stage the Task is at</w:t>
+      </w:r>
+      <w:r>
+        <w:t>.</w:t>
       </w:r>
     </w:p>
     <w:p>
@@ -2596,79 +3232,56 @@
         </w:numPr>
       </w:pPr>
       <w:r>
-        <w:t>To get notified when a change in status is made to a card:</w:t>
-      </w:r>
-    </w:p>
-    <w:p>
-      <w:pPr>
-        <w:pStyle w:val="ListParagraph"/>
-        <w:numPr>
-          <w:ilvl w:val="0"/>
-          <w:numId w:val="2"/>
-        </w:numPr>
-      </w:pPr>
-      <w:r>
-        <w:t>Click on the three dots at the top of the</w:t>
-      </w:r>
-      <w:r>
-        <w:t xml:space="preserve"> card</w:t>
+        <w:t xml:space="preserve">When assigned a card, move it to the appropriate list status as it makes progress and </w:t>
+      </w:r>
+      <w:r>
+        <w:t xml:space="preserve">add the Assignment of the person in charge of each list as it moves forward (i.e. the person assigned as . . . Team QA, Team Editor, Project's </w:t>
+      </w:r>
+      <w:r>
+        <w:t>Chief of Q/A</w:t>
+      </w:r>
+      <w:r>
+        <w:t>, and Project's</w:t>
+      </w:r>
+      <w:r>
+        <w:t xml:space="preserve"> Chief Editor when it is passed to them</w:t>
+      </w:r>
+      <w:r>
+        <w:t>)</w:t>
       </w:r>
       <w:r>
         <w:t>.</w:t>
       </w:r>
-    </w:p>
-    <w:p>
-      <w:pPr>
-        <w:pStyle w:val="ListParagraph"/>
-        <w:numPr>
-          <w:ilvl w:val="0"/>
-          <w:numId w:val="2"/>
-        </w:numPr>
-      </w:pPr>
-      <w:r>
-        <w:t>From the dropdown menu select Watch</w:t>
-      </w:r>
-    </w:p>
-    <w:p>
-      <w:pPr>
-        <w:pStyle w:val="ListParagraph"/>
-        <w:numPr>
-          <w:ilvl w:val="0"/>
-          <w:numId w:val="2"/>
-        </w:numPr>
-      </w:pPr>
-      <w:r>
-        <w:t>An eye will appear on the card to show it is being watched</w:t>
-      </w:r>
-      <w:r>
-        <w:t xml:space="preserve"> and you will get notifications for each change</w:t>
-      </w:r>
-      <w:r>
-        <w:t>.</w:t>
-      </w:r>
-    </w:p>
-    <w:p>
-      <w:pPr>
-        <w:pStyle w:val="ListParagraph"/>
-        <w:numPr>
-          <w:ilvl w:val="0"/>
-          <w:numId w:val="2"/>
-        </w:numPr>
-      </w:pPr>
-      <w:r>
-        <w:t>To stop getting notifications click on the card and click on the eye at the top right.</w:t>
-      </w:r>
-    </w:p>
-    <w:p>
-      <w:pPr>
-        <w:pStyle w:val="ListParagraph"/>
-        <w:numPr>
-          <w:ilvl w:val="0"/>
-          <w:numId w:val="12"/>
-        </w:numPr>
-      </w:pPr>
-      <w:r>
-        <w:t>When assigned a card, move it to the appropriate list status as it makes progress and reassign it to the Chief of Q/A or the Chief Editor when it is passed to them.</w:t>
+      <w:r>
+        <w:t xml:space="preserve"> </w:t>
+      </w:r>
+      <w:r>
+        <w:rPr>
+          <w:b/>
+          <w:bCs/>
+        </w:rPr>
+        <w:t>Note</w:t>
+      </w:r>
+      <w:r>
+        <w:rPr>
+          <w:b/>
+          <w:bCs/>
+        </w:rPr>
+        <w:t xml:space="preserve">: </w:t>
+      </w:r>
+      <w:r>
+        <w:t>A</w:t>
+      </w:r>
+      <w:r>
+        <w:t xml:space="preserve">fter the person in charge of each list is finished and adds the next person's </w:t>
+      </w:r>
+      <w:proofErr w:type="gramStart"/>
+      <w:r>
+        <w:t>name</w:t>
+      </w:r>
+      <w:proofErr w:type="gramEnd"/>
+      <w:r>
+        <w:t xml:space="preserve"> they remove their own name (except for the IC who started the process. Their name stays on the Task Card throughout the whole progression.</w:t>
       </w:r>
     </w:p>
     <w:p>
@@ -2706,7 +3319,7 @@
       </w:r>
     </w:p>
     <w:sectPr>
-      <w:headerReference w:type="default" r:id="rId17"/>
+      <w:headerReference w:type="default" r:id="rId18"/>
       <w:pgSz w:w="12240" w:h="15840"/>
       <w:pgMar w:top="1440" w:right="1440" w:bottom="1440" w:left="1440" w:header="720" w:footer="720" w:gutter="0"/>
       <w:cols w:space="720"/>

</xml_diff>